<commit_message>
Draft_054: hedging pass from Draft_053 (replace FP-table draft)
Treat Draft_053 as content base. New 054 drops the false-positive
category table. Reduces repeated exploratory/descriptive hedging.
Keeps interpretive limits (cannot separate causes, small sample,
VM contrast as local baseline). Qualifies PSAU guidelines and
course claims. States test p-values as measured results.
</commit_message>
<xml_diff>
--- a/thesis/003_ThesisProposal_Draft_054.docx
+++ b/thesis/003_ThesisProposal_Draft_054.docx
@@ -2242,17 +2242,17 @@
           <w:b/>
           <w:bCs/>
         </w:rPr>
-        <w:t xml:space="preserve">Mann-Whitney U Test, </w:t>
-      </w:r>
-      <w:r>
-        <w:rPr>
-          <w:rFonts w:ascii="Georgia" w:hAnsi="Georgia" w:cs="Georgia" w:eastAsia="Georgia"/>
-          <w:sz w:val="22"/>
-          <w:szCs w:val="22"/>
-          <w:b w:val="0"/>
-          <w:bCs w:val="0"/>
-        </w:rPr>
-        <w:t>conceptually, the Mann-Whitney U test (also called the Wilcoxon rank-sum test) is a non-parametric test that compares the distributions of a continuous or ordinal variable between two independent groups. Operationally, this study used it as an exploratory post hoc follow-up after the Kruskal-Wallis test, comparing per-abstract hedge rates (hedges per 100 words) for each pair of disciplines. The test statistic is U = n₁n₂ + [n₁(n₁+1)]/2 − R₁, where n₁ and n₂ are the sample sizes of the two groups and R₁ is the sum of ranks for group 1. A Bonferroni correction for three pairwise tests set α = .017. The reported results were Veterinary Medicine versus Biology p = .011, Veterinary Medicine versus Agriculture p = .034, and Agriculture versus Biology p = .72. Only the Biology–Veterinary Medicine contrast remained significant after correction.</w:t>
+        <w:t xml:space="preserve">Mann-Whitney U Test, conceptually, the Mann-Whitney U test (also called the Wilcoxon rank-sum test) is a non-parametric test that compares the distributions of a continuous or ordinal variable between two independent groups. Operationally, this study used it as a post hoc follow-up after the Kruskal-Wallis test, comparing per-abstract hedge rates (hedges per 100 words) for each pair of disciplines. The test statistic is U = n₁n₂ + [n₁(n₁+1)]/2 − R₁, where n₁ and n₂ are the sample sizes of the two groups and R₁ is the sum of ranks for group 1. A Bonferroni correction for three pairwise tests set α = .017. The reported results were Veterinary Medicine versus Biology p = .011, Veterinary Medicine versus Agriculture p = .034, and Agriculture versus Biology p = .72. Only the Biology–Veterinary Medicine contrast remained significant after correction.</w:t>
+      </w:r>
+      <w:r>
+        <w:rPr>
+          <w:rFonts w:ascii="Georgia" w:hAnsi="Georgia" w:cs="Georgia" w:eastAsia="Georgia"/>
+          <w:sz w:val="22"/>
+          <w:szCs w:val="22"/>
+          <w:b w:val="0"/>
+          <w:bCs w:val="0"/>
+        </w:rPr>
+        <w:t/>
       </w:r>
     </w:p>
     <w:p>
@@ -2579,7 +2579,7 @@
           <w:szCs w:val="22"/>
           <w:rtl w:val="0"/>
         </w:rPr>
-        <w:t xml:space="preserve">The Philippine higher education context is relevant because English is the official medium of academic writing instruction at PSAU despite being a second language for most of the population. Hedging is rarely treated as a distinct rhetorical skill in many Philippine undergraduate writing courses, which tend to emphasize structure and grammatical correctness. Developing researchers writing thesis abstracts were therefore producing a genre that demanded hedging with limited explicit preparation for its epistemic requirements. These conditions made PSAU an appropriate institutional site for examining disciplinary hedging among developing researchers in a Philippine L2 context.</w:t>
+        <w:t xml:space="preserve">The Philippine higher education context is relevant because English is the official medium of academic writing instruction at PSAU despite being a second language for most of the population. In many Philippine undergraduate writing courses, including those that emphasize structure and grammatical correctness more than stance, hedging is seldom taught as a distinct rhetorical skill. Developing researchers writing thesis abstracts were therefore producing a genre that demanded hedging with limited explicit preparation for its epistemic requirements. These conditions made PSAU an appropriate institutional site for examining disciplinary hedging among developing researchers in a Philippine L2 context.</w:t>
       </w:r>
       <w:r>
         <w:rPr>
@@ -2605,7 +2605,7 @@
           <w:szCs w:val="22"/>
           <w:rtl w:val="0"/>
         </w:rPr>
-        <w:t xml:space="preserve">The PSAU thesis guidelines prescribed standard formatting but did not impose a rigid rhetorical template for abstracts. This allowed for disciplinary and individual variation in linguistic choices, ensuring that observed hedging patterns reflected negotiated textual choices rather than rigid institutional constraints.</w:t>
+        <w:t xml:space="preserve">The PSAU thesis guidelines available for this study prescribed standard formatting but did not set a rigid rhetorical template for abstracts. Observed hedging patterns are therefore read as negotiated textual choices within that formatting frame, not as products of a fixed institutional abstract script.</w:t>
       </w:r>
       <w:r>
         <w:rPr>
@@ -2887,7 +2887,7 @@
           <w:bCs/>
           <w:sz w:val="22"/>
         </w:rPr>
-        <w:t xml:space="preserve">e. Data Analysis. </w:t>
+        <w:t xml:space="preserve">e. Data Analysis. Hedge identification, type classification, and functional coding were all conducted manually using a Google Sheets coding template. Each abstract was read in full before coding began to ensure hedges were interpreted in context rather than flagged as isolated tokens. Ambiguous cases were resolved using the predefined decision tree in Appendix A. Frequency counts were normalized per 100 words to enable comparison across abstracts of varying length. In a separate pass, each abstract was also coded for outcome type from its results language (Binary, Continuous, Mixed, Null/NS, Other), so that density patterns could be read against the kind of finding reported. Those codes are recorded in the coding spreadsheet and discussed in Part IV. While the quantitative analysis identified what hedges were used, the qualitative interpretation applied Salager-Meyer’s (1994) claim-responsibility framework and Hyland’s (2005) stance model to explain why these patterns occurred. Given the corpus size, findings were interpreted as indicative patterns within the PSAU context, supplemented by inferential analyses (chi-square, Kruskal-Wallis) whose results are reported transparently but should not be treated as confirmatory given the small, zero-inflated sample.</w:t>
       </w:r>
       <w:r>
         <w:rPr>
@@ -2900,7 +2900,7 @@
           <w:b w:val="0"/>
           <w:bCs w:val="0"/>
         </w:rPr>
-        <w:t>Hedge identification, type classification, and functional coding were all conducted manually using a Google Sheets coding template. Each abstract was read in full before coding began to ensure hedges were interpreted in context rather than flagged as isolated tokens. Ambiguous cases were resolved using the predefined decision tree in Appendix A. Frequency counts were normalized per 100 words to enable comparison across abstracts of varying length. In a separate pass, each abstract was also coded for outcome type from its results language (Binary, Continuous, Mixed, Null/NS, Other), so that density patterns could be read against the kind of finding reported. Those codes are recorded in the coding spreadsheet and discussed in Part IV. While the quantitative analysis identified what hedges were used, the qualitative interpretation applied Salager-Meyer’s (1994) claim-responsibility framework and Hyland’s (2005) stance model to explain why these patterns occurred. Given the corpus size, findings were interpreted as indicative patterns within the PSAU context, supplemented by exploratory inferential analyses (chi-square, Kruskal-Wallis) whose results are reported transparently but should not be treated as confirmatory given the small, zero-inflated sample.</w:t>
+        <w:t/>
       </w:r>
     </w:p>
     <w:p>
@@ -8169,801 +8169,7 @@
           <w:rtl w:val="0"/>
         </w:rPr>
       </w:r>
-      <w:r>
-        <w:rPr>
-          <w:rtl w:val="0"/>
-        </w:rPr>
-      </w:r>
-    </w:p>
-    <w:p>
-      <w:pPr>
-        <w:spacing w:before="720" w:after="0" w:line="480" w:lineRule="auto"/>
-        <w:jc w:val="center"/>
-        <w:keepNext w:val="1"/>
-      </w:pPr>
-      <w:r>
-        <w:rPr>
-          <w:rFonts w:ascii="Georgia" w:hAnsi="Georgia"/>
-          <w:sz w:val="24"/>
-          <w:b/>
-        </w:rPr>
-        <w:t xml:space="preserve">Table 5</w:t>
-      </w:r>
-    </w:p>
-    <w:p>
-      <w:pPr>
-        <w:spacing w:before="0" w:after="60" w:line="480" w:lineRule="auto"/>
-        <w:jc w:val="center"/>
-        <w:keepNext w:val="1"/>
-      </w:pPr>
-      <w:r>
-        <w:rPr>
-          <w:rFonts w:ascii="Georgia" w:hAnsi="Georgia"/>
-          <w:sz w:val="24"/>
-        </w:rPr>
-        <w:t xml:space="preserve">False Positive Tokens by Category and Discipline</w:t>
-      </w:r>
-    </w:p>
-    <w:tbl>
-      <w:tblPr>
-        <w:tblW w:w="9000" w:type="dxa"/>
-        <w:tblBorders>
-          <w:top w:color="000000" w:space="0" w:sz="18" w:val="single"/>
-          <w:left w:color="000000" w:space="0" w:sz="0" w:val="nil"/>
-          <w:bottom w:color="000000" w:space="0" w:sz="18" w:val="single"/>
-          <w:right w:color="000000" w:space="0" w:sz="0" w:val="nil"/>
-          <w:insideH w:color="000000" w:space="0" w:sz="0" w:val="nil"/>
-          <w:insideV w:color="000000" w:space="0" w:sz="0" w:val="nil"/>
-        </w:tblBorders>
-      </w:tblPr>
-      <w:tblGrid>
-        <w:gridCol w:w="1600"/>
-        <w:gridCol w:w="1400"/>
-        <w:gridCol w:w="1200"/>
-        <w:gridCol w:w="1800"/>
-        <w:gridCol w:w="1000"/>
-        <w:gridCol w:w="1000"/>
-      </w:tblGrid>
-      <w:tr>
-        <w:trPr>
-          <w:cantSplit w:val="1"/>
-          <w:tblHeader w:val="1"/>
-        </w:trPr>
-        <w:tc>
-          <w:tcPr>
-            <w:tcW w:w="1600" w:type="dxa"/>
-          </w:tcPr>
-          <w:p>
-            <w:pPr>
-              <w:spacing w:before="0" w:after="0" w:line="240" w:lineRule="auto"/>
-              <w:jc w:val="center"/>
-            </w:pPr>
-            <w:r>
-              <w:rPr>
-                <w:rFonts w:ascii="Georgia" w:hAnsi="Georgia"/>
-                <w:sz w:val="18"/>
-                <w:szCs w:val="18"/>
-                <w:b/>
-                <w:bCs/>
-              </w:rPr>
-              <w:t xml:space="preserve">Category</w:t>
-            </w:r>
-          </w:p>
-        </w:tc>
-        <w:tc>
-          <w:tcPr>
-            <w:tcW w:w="1400" w:type="dxa"/>
-          </w:tcPr>
-          <w:p>
-            <w:pPr>
-              <w:spacing w:before="0" w:after="0" w:line="240" w:lineRule="auto"/>
-              <w:jc w:val="center"/>
-            </w:pPr>
-            <w:r>
-              <w:rPr>
-                <w:rFonts w:ascii="Georgia" w:hAnsi="Georgia"/>
-                <w:sz w:val="18"/>
-                <w:szCs w:val="18"/>
-                <w:b/>
-                <w:bCs/>
-              </w:rPr>
-              <w:t xml:space="preserve">Agriculture</w:t>
-            </w:r>
-          </w:p>
-        </w:tc>
-        <w:tc>
-          <w:tcPr>
-            <w:tcW w:w="1200" w:type="dxa"/>
-          </w:tcPr>
-          <w:p>
-            <w:pPr>
-              <w:spacing w:before="0" w:after="0" w:line="240" w:lineRule="auto"/>
-              <w:jc w:val="center"/>
-            </w:pPr>
-            <w:r>
-              <w:rPr>
-                <w:rFonts w:ascii="Georgia" w:hAnsi="Georgia"/>
-                <w:sz w:val="18"/>
-                <w:szCs w:val="18"/>
-                <w:b/>
-                <w:bCs/>
-              </w:rPr>
-              <w:t xml:space="preserve">Biology</w:t>
-            </w:r>
-          </w:p>
-        </w:tc>
-        <w:tc>
-          <w:tcPr>
-            <w:tcW w:w="1800" w:type="dxa"/>
-          </w:tcPr>
-          <w:p>
-            <w:pPr>
-              <w:spacing w:before="0" w:after="0" w:line="240" w:lineRule="auto"/>
-              <w:jc w:val="center"/>
-            </w:pPr>
-            <w:r>
-              <w:rPr>
-                <w:rFonts w:ascii="Georgia" w:hAnsi="Georgia"/>
-                <w:sz w:val="18"/>
-                <w:szCs w:val="18"/>
-                <w:b/>
-                <w:bCs/>
-              </w:rPr>
-              <w:t xml:space="preserve">Veterinary Medicine</w:t>
-            </w:r>
-          </w:p>
-        </w:tc>
-        <w:tc>
-          <w:tcPr>
-            <w:tcW w:w="1000" w:type="dxa"/>
-          </w:tcPr>
-          <w:p>
-            <w:pPr>
-              <w:spacing w:before="0" w:after="0" w:line="240" w:lineRule="auto"/>
-              <w:jc w:val="center"/>
-            </w:pPr>
-            <w:r>
-              <w:rPr>
-                <w:rFonts w:ascii="Georgia" w:hAnsi="Georgia"/>
-                <w:sz w:val="18"/>
-                <w:szCs w:val="18"/>
-                <w:b/>
-                <w:bCs/>
-              </w:rPr>
-              <w:t xml:space="preserve">Count</w:t>
-            </w:r>
-          </w:p>
-        </w:tc>
-        <w:tc>
-          <w:tcPr>
-            <w:tcW w:w="1000" w:type="dxa"/>
-          </w:tcPr>
-          <w:p>
-            <w:pPr>
-              <w:spacing w:before="0" w:after="0" w:line="240" w:lineRule="auto"/>
-              <w:jc w:val="center"/>
-            </w:pPr>
-            <w:r>
-              <w:rPr>
-                <w:rFonts w:ascii="Georgia" w:hAnsi="Georgia"/>
-                <w:sz w:val="18"/>
-                <w:szCs w:val="18"/>
-                <w:b/>
-                <w:bCs/>
-              </w:rPr>
-              <w:t xml:space="preserve">% of 58</w:t>
-            </w:r>
-          </w:p>
-        </w:tc>
-      </w:tr>
-      <w:tr>
-        <w:trPr>
-          <w:cantSplit w:val="1"/>
-        </w:trPr>
-        <w:tc>
-          <w:tcPr>
-            <w:tcW w:w="1600" w:type="dxa"/>
-          </w:tcPr>
-          <w:p>
-            <w:pPr>
-              <w:spacing w:before="0" w:after="0" w:line="240" w:lineRule="auto"/>
-              <w:jc w:val="center"/>
-            </w:pPr>
-            <w:r>
-              <w:rPr>
-                <w:rFonts w:ascii="Georgia" w:hAnsi="Georgia"/>
-                <w:sz w:val="18"/>
-                <w:szCs w:val="18"/>
-              </w:rPr>
-              <w:t xml:space="preserve">FP-Gen</w:t>
-            </w:r>
-          </w:p>
-        </w:tc>
-        <w:tc>
-          <w:tcPr>
-            <w:tcW w:w="1400" w:type="dxa"/>
-          </w:tcPr>
-          <w:p>
-            <w:pPr>
-              <w:spacing w:before="0" w:after="0" w:line="240" w:lineRule="auto"/>
-              <w:jc w:val="center"/>
-            </w:pPr>
-            <w:r>
-              <w:rPr>
-                <w:rFonts w:ascii="Georgia" w:hAnsi="Georgia"/>
-                <w:sz w:val="18"/>
-                <w:szCs w:val="18"/>
-              </w:rPr>
-              <w:t xml:space="preserve">5</w:t>
-            </w:r>
-          </w:p>
-        </w:tc>
-        <w:tc>
-          <w:tcPr>
-            <w:tcW w:w="1200" w:type="dxa"/>
-          </w:tcPr>
-          <w:p>
-            <w:pPr>
-              <w:spacing w:before="0" w:after="0" w:line="240" w:lineRule="auto"/>
-              <w:jc w:val="center"/>
-            </w:pPr>
-            <w:r>
-              <w:rPr>
-                <w:rFonts w:ascii="Georgia" w:hAnsi="Georgia"/>
-                <w:sz w:val="18"/>
-                <w:szCs w:val="18"/>
-              </w:rPr>
-              <w:t xml:space="preserve">23</w:t>
-            </w:r>
-          </w:p>
-        </w:tc>
-        <w:tc>
-          <w:tcPr>
-            <w:tcW w:w="1800" w:type="dxa"/>
-          </w:tcPr>
-          <w:p>
-            <w:pPr>
-              <w:spacing w:before="0" w:after="0" w:line="240" w:lineRule="auto"/>
-              <w:jc w:val="center"/>
-            </w:pPr>
-            <w:r>
-              <w:rPr>
-                <w:rFonts w:ascii="Georgia" w:hAnsi="Georgia"/>
-                <w:sz w:val="18"/>
-                <w:szCs w:val="18"/>
-              </w:rPr>
-              <w:t xml:space="preserve">5</w:t>
-            </w:r>
-          </w:p>
-        </w:tc>
-        <w:tc>
-          <w:tcPr>
-            <w:tcW w:w="1000" w:type="dxa"/>
-          </w:tcPr>
-          <w:p>
-            <w:pPr>
-              <w:spacing w:before="0" w:after="0" w:line="240" w:lineRule="auto"/>
-              <w:jc w:val="center"/>
-            </w:pPr>
-            <w:r>
-              <w:rPr>
-                <w:rFonts w:ascii="Georgia" w:hAnsi="Georgia"/>
-                <w:sz w:val="18"/>
-                <w:szCs w:val="18"/>
-              </w:rPr>
-              <w:t xml:space="preserve">33</w:t>
-            </w:r>
-          </w:p>
-        </w:tc>
-        <w:tc>
-          <w:tcPr>
-            <w:tcW w:w="1000" w:type="dxa"/>
-          </w:tcPr>
-          <w:p>
-            <w:pPr>
-              <w:spacing w:before="0" w:after="0" w:line="240" w:lineRule="auto"/>
-              <w:jc w:val="center"/>
-            </w:pPr>
-            <w:r>
-              <w:rPr>
-                <w:rFonts w:ascii="Georgia" w:hAnsi="Georgia"/>
-                <w:sz w:val="18"/>
-                <w:szCs w:val="18"/>
-              </w:rPr>
-              <w:t xml:space="preserve">56.9%</w:t>
-            </w:r>
-          </w:p>
-        </w:tc>
-      </w:tr>
-      <w:tr>
-        <w:trPr>
-          <w:cantSplit w:val="1"/>
-        </w:trPr>
-        <w:tc>
-          <w:tcPr>
-            <w:tcW w:w="1600" w:type="dxa"/>
-          </w:tcPr>
-          <w:p>
-            <w:pPr>
-              <w:spacing w:before="0" w:after="0" w:line="240" w:lineRule="auto"/>
-              <w:jc w:val="center"/>
-            </w:pPr>
-            <w:r>
-              <w:rPr>
-                <w:rFonts w:ascii="Georgia" w:hAnsi="Georgia"/>
-                <w:sz w:val="18"/>
-                <w:szCs w:val="18"/>
-              </w:rPr>
-              <w:t xml:space="preserve">FP-Rec</w:t>
-            </w:r>
-          </w:p>
-        </w:tc>
-        <w:tc>
-          <w:tcPr>
-            <w:tcW w:w="1400" w:type="dxa"/>
-          </w:tcPr>
-          <w:p>
-            <w:pPr>
-              <w:spacing w:before="0" w:after="0" w:line="240" w:lineRule="auto"/>
-              <w:jc w:val="center"/>
-            </w:pPr>
-            <w:r>
-              <w:rPr>
-                <w:rFonts w:ascii="Georgia" w:hAnsi="Georgia"/>
-                <w:sz w:val="18"/>
-                <w:szCs w:val="18"/>
-              </w:rPr>
-              <w:t xml:space="preserve">4</w:t>
-            </w:r>
-          </w:p>
-        </w:tc>
-        <w:tc>
-          <w:tcPr>
-            <w:tcW w:w="1200" w:type="dxa"/>
-          </w:tcPr>
-          <w:p>
-            <w:pPr>
-              <w:spacing w:before="0" w:after="0" w:line="240" w:lineRule="auto"/>
-              <w:jc w:val="center"/>
-            </w:pPr>
-            <w:r>
-              <w:rPr>
-                <w:rFonts w:ascii="Georgia" w:hAnsi="Georgia"/>
-                <w:sz w:val="18"/>
-                <w:szCs w:val="18"/>
-              </w:rPr>
-              <w:t xml:space="preserve">5</w:t>
-            </w:r>
-          </w:p>
-        </w:tc>
-        <w:tc>
-          <w:tcPr>
-            <w:tcW w:w="1800" w:type="dxa"/>
-          </w:tcPr>
-          <w:p>
-            <w:pPr>
-              <w:spacing w:before="0" w:after="0" w:line="240" w:lineRule="auto"/>
-              <w:jc w:val="center"/>
-            </w:pPr>
-            <w:r>
-              <w:rPr>
-                <w:rFonts w:ascii="Georgia" w:hAnsi="Georgia"/>
-                <w:sz w:val="18"/>
-                <w:szCs w:val="18"/>
-              </w:rPr>
-              <w:t xml:space="preserve">6</w:t>
-            </w:r>
-          </w:p>
-        </w:tc>
-        <w:tc>
-          <w:tcPr>
-            <w:tcW w:w="1000" w:type="dxa"/>
-          </w:tcPr>
-          <w:p>
-            <w:pPr>
-              <w:spacing w:before="0" w:after="0" w:line="240" w:lineRule="auto"/>
-              <w:jc w:val="center"/>
-            </w:pPr>
-            <w:r>
-              <w:rPr>
-                <w:rFonts w:ascii="Georgia" w:hAnsi="Georgia"/>
-                <w:sz w:val="18"/>
-                <w:szCs w:val="18"/>
-              </w:rPr>
-              <w:t xml:space="preserve">15</w:t>
-            </w:r>
-          </w:p>
-        </w:tc>
-        <w:tc>
-          <w:tcPr>
-            <w:tcW w:w="1000" w:type="dxa"/>
-          </w:tcPr>
-          <w:p>
-            <w:pPr>
-              <w:spacing w:before="0" w:after="0" w:line="240" w:lineRule="auto"/>
-              <w:jc w:val="center"/>
-            </w:pPr>
-            <w:r>
-              <w:rPr>
-                <w:rFonts w:ascii="Georgia" w:hAnsi="Georgia"/>
-                <w:sz w:val="18"/>
-                <w:szCs w:val="18"/>
-              </w:rPr>
-              <w:t xml:space="preserve">25.9%</w:t>
-            </w:r>
-          </w:p>
-        </w:tc>
-      </w:tr>
-      <w:tr>
-        <w:trPr>
-          <w:cantSplit w:val="1"/>
-        </w:trPr>
-        <w:tc>
-          <w:tcPr>
-            <w:tcW w:w="1600" w:type="dxa"/>
-          </w:tcPr>
-          <w:p>
-            <w:pPr>
-              <w:spacing w:before="0" w:after="0" w:line="240" w:lineRule="auto"/>
-              <w:jc w:val="center"/>
-            </w:pPr>
-            <w:r>
-              <w:rPr>
-                <w:rFonts w:ascii="Georgia" w:hAnsi="Georgia"/>
-                <w:sz w:val="18"/>
-                <w:szCs w:val="18"/>
-              </w:rPr>
-              <w:t xml:space="preserve">FP-Cap</w:t>
-            </w:r>
-          </w:p>
-        </w:tc>
-        <w:tc>
-          <w:tcPr>
-            <w:tcW w:w="1400" w:type="dxa"/>
-          </w:tcPr>
-          <w:p>
-            <w:pPr>
-              <w:spacing w:before="0" w:after="0" w:line="240" w:lineRule="auto"/>
-              <w:jc w:val="center"/>
-            </w:pPr>
-            <w:r>
-              <w:rPr>
-                <w:rFonts w:ascii="Georgia" w:hAnsi="Georgia"/>
-                <w:sz w:val="18"/>
-                <w:szCs w:val="18"/>
-              </w:rPr>
-              <w:t xml:space="preserve">5</w:t>
-            </w:r>
-          </w:p>
-        </w:tc>
-        <w:tc>
-          <w:tcPr>
-            <w:tcW w:w="1200" w:type="dxa"/>
-          </w:tcPr>
-          <w:p>
-            <w:pPr>
-              <w:spacing w:before="0" w:after="0" w:line="240" w:lineRule="auto"/>
-              <w:jc w:val="center"/>
-            </w:pPr>
-            <w:r>
-              <w:rPr>
-                <w:rFonts w:ascii="Georgia" w:hAnsi="Georgia"/>
-                <w:sz w:val="18"/>
-                <w:szCs w:val="18"/>
-              </w:rPr>
-              <w:t xml:space="preserve">2</w:t>
-            </w:r>
-          </w:p>
-        </w:tc>
-        <w:tc>
-          <w:tcPr>
-            <w:tcW w:w="1800" w:type="dxa"/>
-          </w:tcPr>
-          <w:p>
-            <w:pPr>
-              <w:spacing w:before="0" w:after="0" w:line="240" w:lineRule="auto"/>
-              <w:jc w:val="center"/>
-            </w:pPr>
-            <w:r>
-              <w:rPr>
-                <w:rFonts w:ascii="Georgia" w:hAnsi="Georgia"/>
-                <w:sz w:val="18"/>
-                <w:szCs w:val="18"/>
-              </w:rPr>
-              <w:t xml:space="preserve">1</w:t>
-            </w:r>
-          </w:p>
-        </w:tc>
-        <w:tc>
-          <w:tcPr>
-            <w:tcW w:w="1000" w:type="dxa"/>
-          </w:tcPr>
-          <w:p>
-            <w:pPr>
-              <w:spacing w:before="0" w:after="0" w:line="240" w:lineRule="auto"/>
-              <w:jc w:val="center"/>
-            </w:pPr>
-            <w:r>
-              <w:rPr>
-                <w:rFonts w:ascii="Georgia" w:hAnsi="Georgia"/>
-                <w:sz w:val="18"/>
-                <w:szCs w:val="18"/>
-              </w:rPr>
-              <w:t xml:space="preserve">8</w:t>
-            </w:r>
-          </w:p>
-        </w:tc>
-        <w:tc>
-          <w:tcPr>
-            <w:tcW w:w="1000" w:type="dxa"/>
-          </w:tcPr>
-          <w:p>
-            <w:pPr>
-              <w:spacing w:before="0" w:after="0" w:line="240" w:lineRule="auto"/>
-              <w:jc w:val="center"/>
-            </w:pPr>
-            <w:r>
-              <w:rPr>
-                <w:rFonts w:ascii="Georgia" w:hAnsi="Georgia"/>
-                <w:sz w:val="18"/>
-                <w:szCs w:val="18"/>
-              </w:rPr>
-              <w:t xml:space="preserve">13.8%</w:t>
-            </w:r>
-          </w:p>
-        </w:tc>
-      </w:tr>
-      <w:tr>
-        <w:trPr>
-          <w:cantSplit w:val="1"/>
-        </w:trPr>
-        <w:tc>
-          <w:tcPr>
-            <w:tcW w:w="1600" w:type="dxa"/>
-          </w:tcPr>
-          <w:p>
-            <w:pPr>
-              <w:spacing w:before="0" w:after="0" w:line="240" w:lineRule="auto"/>
-              <w:jc w:val="center"/>
-            </w:pPr>
-            <w:r>
-              <w:rPr>
-                <w:rFonts w:ascii="Georgia" w:hAnsi="Georgia"/>
-                <w:sz w:val="18"/>
-                <w:szCs w:val="18"/>
-              </w:rPr>
-              <w:t xml:space="preserve">FP-Proc</w:t>
-            </w:r>
-          </w:p>
-        </w:tc>
-        <w:tc>
-          <w:tcPr>
-            <w:tcW w:w="1400" w:type="dxa"/>
-          </w:tcPr>
-          <w:p>
-            <w:pPr>
-              <w:spacing w:before="0" w:after="0" w:line="240" w:lineRule="auto"/>
-              <w:jc w:val="center"/>
-            </w:pPr>
-            <w:r>
-              <w:rPr>
-                <w:rFonts w:ascii="Georgia" w:hAnsi="Georgia"/>
-                <w:sz w:val="18"/>
-                <w:szCs w:val="18"/>
-              </w:rPr>
-              <w:t xml:space="preserve">0</w:t>
-            </w:r>
-          </w:p>
-        </w:tc>
-        <w:tc>
-          <w:tcPr>
-            <w:tcW w:w="1200" w:type="dxa"/>
-          </w:tcPr>
-          <w:p>
-            <w:pPr>
-              <w:spacing w:before="0" w:after="0" w:line="240" w:lineRule="auto"/>
-              <w:jc w:val="center"/>
-            </w:pPr>
-            <w:r>
-              <w:rPr>
-                <w:rFonts w:ascii="Georgia" w:hAnsi="Georgia"/>
-                <w:sz w:val="18"/>
-                <w:szCs w:val="18"/>
-              </w:rPr>
-              <w:t xml:space="preserve">2</w:t>
-            </w:r>
-          </w:p>
-        </w:tc>
-        <w:tc>
-          <w:tcPr>
-            <w:tcW w:w="1800" w:type="dxa"/>
-          </w:tcPr>
-          <w:p>
-            <w:pPr>
-              <w:spacing w:before="0" w:after="0" w:line="240" w:lineRule="auto"/>
-              <w:jc w:val="center"/>
-            </w:pPr>
-            <w:r>
-              <w:rPr>
-                <w:rFonts w:ascii="Georgia" w:hAnsi="Georgia"/>
-                <w:sz w:val="18"/>
-                <w:szCs w:val="18"/>
-              </w:rPr>
-              <w:t xml:space="preserve">0</w:t>
-            </w:r>
-          </w:p>
-        </w:tc>
-        <w:tc>
-          <w:tcPr>
-            <w:tcW w:w="1000" w:type="dxa"/>
-          </w:tcPr>
-          <w:p>
-            <w:pPr>
-              <w:spacing w:before="0" w:after="0" w:line="240" w:lineRule="auto"/>
-              <w:jc w:val="center"/>
-            </w:pPr>
-            <w:r>
-              <w:rPr>
-                <w:rFonts w:ascii="Georgia" w:hAnsi="Georgia"/>
-                <w:sz w:val="18"/>
-                <w:szCs w:val="18"/>
-              </w:rPr>
-              <w:t xml:space="preserve">2</w:t>
-            </w:r>
-          </w:p>
-        </w:tc>
-        <w:tc>
-          <w:tcPr>
-            <w:tcW w:w="1000" w:type="dxa"/>
-          </w:tcPr>
-          <w:p>
-            <w:pPr>
-              <w:spacing w:before="0" w:after="0" w:line="240" w:lineRule="auto"/>
-              <w:jc w:val="center"/>
-            </w:pPr>
-            <w:r>
-              <w:rPr>
-                <w:rFonts w:ascii="Georgia" w:hAnsi="Georgia"/>
-                <w:sz w:val="18"/>
-                <w:szCs w:val="18"/>
-              </w:rPr>
-              <w:t xml:space="preserve">3.4%</w:t>
-            </w:r>
-          </w:p>
-        </w:tc>
-      </w:tr>
-      <w:tr>
-        <w:trPr>
-          <w:cantSplit w:val="1"/>
-        </w:trPr>
-        <w:tc>
-          <w:tcPr>
-            <w:tcW w:w="1600" w:type="dxa"/>
-          </w:tcPr>
-          <w:p>
-            <w:pPr>
-              <w:spacing w:before="0" w:after="0" w:line="240" w:lineRule="auto"/>
-              <w:jc w:val="center"/>
-            </w:pPr>
-            <w:r>
-              <w:rPr>
-                <w:rFonts w:ascii="Georgia" w:hAnsi="Georgia"/>
-                <w:sz w:val="18"/>
-                <w:szCs w:val="18"/>
-                <w:b/>
-                <w:bCs/>
-              </w:rPr>
-              <w:t xml:space="preserve">Total</w:t>
-            </w:r>
-          </w:p>
-        </w:tc>
-        <w:tc>
-          <w:tcPr>
-            <w:tcW w:w="1400" w:type="dxa"/>
-          </w:tcPr>
-          <w:p>
-            <w:pPr>
-              <w:spacing w:before="0" w:after="0" w:line="240" w:lineRule="auto"/>
-              <w:jc w:val="center"/>
-            </w:pPr>
-            <w:r>
-              <w:rPr>
-                <w:rFonts w:ascii="Georgia" w:hAnsi="Georgia"/>
-                <w:sz w:val="18"/>
-                <w:szCs w:val="18"/>
-                <w:b/>
-                <w:bCs/>
-              </w:rPr>
-              <w:t xml:space="preserve">14</w:t>
-            </w:r>
-          </w:p>
-        </w:tc>
-        <w:tc>
-          <w:tcPr>
-            <w:tcW w:w="1200" w:type="dxa"/>
-          </w:tcPr>
-          <w:p>
-            <w:pPr>
-              <w:spacing w:before="0" w:after="0" w:line="240" w:lineRule="auto"/>
-              <w:jc w:val="center"/>
-            </w:pPr>
-            <w:r>
-              <w:rPr>
-                <w:rFonts w:ascii="Georgia" w:hAnsi="Georgia"/>
-                <w:sz w:val="18"/>
-                <w:szCs w:val="18"/>
-                <w:b/>
-                <w:bCs/>
-              </w:rPr>
-              <w:t xml:space="preserve">32</w:t>
-            </w:r>
-          </w:p>
-        </w:tc>
-        <w:tc>
-          <w:tcPr>
-            <w:tcW w:w="1800" w:type="dxa"/>
-          </w:tcPr>
-          <w:p>
-            <w:pPr>
-              <w:spacing w:before="0" w:after="0" w:line="240" w:lineRule="auto"/>
-              <w:jc w:val="center"/>
-            </w:pPr>
-            <w:r>
-              <w:rPr>
-                <w:rFonts w:ascii="Georgia" w:hAnsi="Georgia"/>
-                <w:sz w:val="18"/>
-                <w:szCs w:val="18"/>
-                <w:b/>
-                <w:bCs/>
-              </w:rPr>
-              <w:t xml:space="preserve">12</w:t>
-            </w:r>
-          </w:p>
-        </w:tc>
-        <w:tc>
-          <w:tcPr>
-            <w:tcW w:w="1000" w:type="dxa"/>
-          </w:tcPr>
-          <w:p>
-            <w:pPr>
-              <w:spacing w:before="0" w:after="0" w:line="240" w:lineRule="auto"/>
-              <w:jc w:val="center"/>
-            </w:pPr>
-            <w:r>
-              <w:rPr>
-                <w:rFonts w:ascii="Georgia" w:hAnsi="Georgia"/>
-                <w:sz w:val="18"/>
-                <w:szCs w:val="18"/>
-                <w:b/>
-                <w:bCs/>
-              </w:rPr>
-              <w:t xml:space="preserve">58</w:t>
-            </w:r>
-          </w:p>
-        </w:tc>
-        <w:tc>
-          <w:tcPr>
-            <w:tcW w:w="1000" w:type="dxa"/>
-          </w:tcPr>
-          <w:p>
-            <w:pPr>
-              <w:spacing w:before="0" w:after="0" w:line="240" w:lineRule="auto"/>
-              <w:jc w:val="center"/>
-            </w:pPr>
-            <w:r>
-              <w:rPr>
-                <w:rFonts w:ascii="Georgia" w:hAnsi="Georgia"/>
-                <w:sz w:val="18"/>
-                <w:szCs w:val="18"/>
-                <w:b/>
-                <w:bCs/>
-              </w:rPr>
-              <w:t xml:space="preserve">100%</w:t>
-            </w:r>
-          </w:p>
-        </w:tc>
-      </w:tr>
-    </w:tbl>
+    </w:p>
     <w:p>
       <w:pPr>
         <w:spacing w:before="0" w:after="0" w:line="480" w:lineRule="auto"/>
@@ -9080,7 +8286,7 @@
           <w:b/>
           <w:sz w:val="24"/>
         </w:rPr>
-        <w:t>Table 6</w:t>
+        <w:t>Table 5</w:t>
       </w:r>
     </w:p>
     <w:p>
@@ -10476,7 +9682,7 @@
           <w:szCs w:val="22"/>
           <w:rtl w:val="0"/>
         </w:rPr>
-        <w:t>Table 6 shows that Agriculture had the highest hedge density at 0.63 per 100 words (27 hedges across 4,300 words), followed by Biology at 0.62 (28 hedges across 4,509 words), and Veterinary Medicine at 0.20 (10 hedges across 5,060 words). The overall corpus density was 0.47 hedges per 100 words. Agriculture’s lead over Biology is marginal (0.01 hedges per 100 words), but Veterinary Medicine’s density is notably lower than both, at approximately one-third of Agriculture’s rate and one-third of Biology’s.</w:t>
+        <w:t>Table 5 shows that Agriculture had the highest hedge density at 0.63 per 100 words (27 hedges across 4,300 words), followed by Biology at 0.62 (28 hedges across 4,509 words), and Veterinary Medicine at 0.20 (10 hedges across 5,060 words). The overall corpus density was 0.47 hedges per 100 words. Agriculture’s lead over Biology is marginal (0.01 hedges per 100 words), but Veterinary Medicine’s density is notably lower than both, at approximately one-third of Agriculture’s rate and one-third of Biology’s.</w:t>
       </w:r>
       <w:r>
         <w:rPr>
@@ -10703,7 +9909,7 @@
           <w:b/>
           <w:sz w:val="24"/>
         </w:rPr>
-        <w:t>Table 7</w:t>
+        <w:t>Table 6</w:t>
       </w:r>
     </w:p>
     <w:p>
@@ -11353,7 +10559,7 @@
           <w:sz w:val="22"/>
           <w:szCs w:val="22"/>
         </w:rPr>
-        <w:t>Parts I through III map frequency, function, and cross-disciplinary density. The contrasts below are exploratory descriptions of what was observed here, not stable discipline-level characteristics. As reported in Part II, the Kruskal-Wallis test on rates reached p = .025. Exploratory pairwise Mann-Whitney tests with Bonferroni correction leave only the Biology–Veterinary Medicine contrast significant. The chi-square on zero-hedge rates was p = .079. Generalization beyond this corpus is not warranted. The patterns are read through Salager-Meyer’s (1994) claim-responsibility framework and Hyland’s (2005) stance model.</w:t>
+        <w:t xml:space="preserve">Parts I through III map frequency, function, and cross-disciplinary density. The contrasts below describe what was observed in this corpus. They are not presented as stable discipline-level characteristics. Inferential tests are exploratory, as stated in Scope and Limitations. As reported in Part II, the Kruskal-Wallis test on rates reached p = .025. Pairwise Mann-Whitney tests with Bonferroni correction leave only the Biology–Veterinary Medicine contrast significant. The chi-square on zero-hedge rates was p = .079. Generalization beyond this corpus is not warranted. The patterns are read through Salager-Meyer’s (1994) claim-responsibility framework and Hyland’s (2005) stance model.</w:t>
       </w:r>
     </w:p>
     <w:p>
@@ -11370,7 +10576,7 @@
           <w:sz w:val="24"/>
           <w:szCs w:val="24"/>
         </w:rPr>
-        <w:t>Table 8</w:t>
+        <w:t>Table 7</w:t>
       </w:r>
     </w:p>
     <w:p>
@@ -12354,7 +11560,7 @@
           <w:sz w:val="22"/>
           <w:szCs w:val="22"/>
         </w:rPr>
-        <w:t>Limited evidence of disciplinary differentiation, mainly Veterinary Medicine’s lower density. Agriculture’s edge over Biology is modest and outlier-sensitive. Acs2 illustrates rescue-hedging after a non-significant result, which links to the introduction’s concern with overclaiming, but it is a single abstract. The Null/NS mean in Agriculture falls to the same level as non-Null Agriculture once Acs2 is removed. The data cannot separate field norms, adviser practice, and outcome type. Agriculture has no Binary outcomes here, so discipline and study design remain entangled. Statistical evidence is exploratory (Kruskal-Wallis on rates p = .025, and pairwise Mann-Whitney tests with Bonferroni correction leave Biology–Veterinary Medicine as the surviving contrast) and the sample is small. The study provides a local baseline: VM abstracts in this corpus hedge less. The causes remain unknown.</w:t>
+        <w:t xml:space="preserve">Limited evidence of disciplinary differentiation, mainly Veterinary Medicine’s lower density. Agriculture’s edge over Biology is modest and outlier-sensitive. Acs2 illustrates rescue-hedging after a non-significant result, which links to the introduction’s concern with overclaiming, but it is a single abstract. The Null/NS mean in Agriculture falls to the same level as non-Null Agriculture once Acs2 is removed. The data cannot separate field norms, adviser practice, and outcome type. Agriculture has no Binary outcomes here, so discipline and study design remain entangled. The Kruskal-Wallis test on rates was p = .025. Pairwise Mann-Whitney tests with Bonferroni correction leave Biology–Veterinary Medicine as the surviving contrast. Those tests are exploratory and the sample is small, as noted in Scope. The study provides a local baseline: VM abstracts in this corpus hedge less. The causes remain unknown.</w:t>
       </w:r>
       <w:r>
         <w:rPr>

</xml_diff>

<commit_message>
Draft_054: verify-and-fix claim issues from panel notes
From Draft_053 base (no FP table). Exact Kruskal-Wallis H = 7.44,
p = .024 (recomputed). Cut rigid-template vs adviser contradiction.
Scope PSAU course/guidelines claims. Cite underuse claim. Soften
factive-verb generalization. Keep interpretive limits; reduce pile-up.
</commit_message>
<xml_diff>
--- a/thesis/003_ThesisProposal_Draft_054.docx
+++ b/thesis/003_ThesisProposal_Draft_054.docx
@@ -401,7 +401,7 @@
           <w:szCs w:val="22"/>
           <w:rtl w:val="0"/>
         </w:rPr>
-        <w:t xml:space="preserve">Expert writers hedge to present claims with caution rather than absolute certainty. Hyland (1998) showed that hedging is a core rhetorical resource: devices such as may, suggest, or generally signal epistemic stance and mark membership in disciplinary communities. Expert norms are well documented. Far less is known about undergraduate thesis writers, who face the same genre expectations without the same disciplinary training. Do their abstracts reflect field-specific conventions, or only a generic style of caution?</w:t>
+        <w:t xml:space="preserve">Expert writers hedge to present claims with caution rather than absolute certainty. Hyland (1998) showed that hedging is a core rhetorical resource: devices such as may, suggest, or generally signal epistemic stance and mark membership in disciplinary communities. Those expert norms are well documented in that literature. Far less is known about undergraduate thesis writers, who face the same genre expectations without the same disciplinary training. Do their abstracts reflect field-specific conventions, or only a generic style of caution?</w:t>
       </w:r>
       <w:r>
         <w:rPr>
@@ -505,7 +505,7 @@
           <w:szCs w:val="22"/>
           <w:rtl w:val="0"/>
         </w:rPr>
-        <w:t>Developing researchers tend to underuse hedges and rely on a narrow set of devices. Khunasathitchai et al. (2025) found an average of only 1.47 hedges per abstract in 60 Thai undergraduate English-major research abstracts, with modal verbs dominant. Suratno and Aydawati (2025) reported a similar pattern in the discussion sections of Indonesian undergraduate theses: heavy reliance on a single modal (dapat), which they link to limited exposure rather than weak grammar. On a larger scale, Wang (2022) examined 829 papers across 16 fields in the Michigan Corpus of Upper-Level Student Papers and confirmed that disciplinary variation is detectable even among developing writers. Philosophy and Psychology hedged more than Physics and History, yet modal verbs remained the dominant form across disciplines.</w:t>
+        <w:t xml:space="preserve">Developing researchers tend to underuse hedges and rely on a narrow set of devices (Khunasathitchai et al., 2025; Suratno &amp; Aydawati, 2025). Khunasathitchai et al. (2025) found an average of only 1.47 hedges per abstract in 60 Thai undergraduate English-major research abstracts, with modal verbs dominant. Suratno and Aydawati (2025) reported a similar pattern in the discussion sections of Indonesian undergraduate theses: heavy reliance on a single modal (dapat), which they link to limited exposure rather than weak grammar. On a larger scale, Wang (2022) examined 829 papers across 16 fields in the Michigan Corpus of Upper-Level Student Papers and confirmed that disciplinary variation is detectable even among developing writers. Philosophy and Psychology hedged more than Physics and History, yet modal verbs remained the dominant form across disciplines.</w:t>
       </w:r>
       <w:r>
         <w:rPr>
@@ -2167,7 +2167,7 @@
           <w:b/>
           <w:bCs/>
         </w:rPr>
-        <w:t xml:space="preserve">Kruskal-Wallis Test, </w:t>
+        <w:t xml:space="preserve">Kruskal-Wallis Test, conceptually, the Kruskal-Wallis test is a non-parametric rank-based alternative to one-way ANOVA for comparing distributions across three or more independent groups. Operationally, this study applied it to per-abstract hedge rates (hedges per 100 words) across the three disciplines. The test statistic is H = [12 / (N(N+1))] × Σ (Rⱼ² / nⱼ) − 3(N+1), where N is the total number of observations, nⱼ is the size of group j, and Rⱼ is the sum of ranks for group j. The reported result was H = 7.44, p = .024.</w:t>
       </w:r>
       <w:r>
         <w:rPr>
@@ -2180,7 +2180,7 @@
           <w:b w:val="0"/>
           <w:bCs w:val="0"/>
         </w:rPr>
-        <w:t>conceptually, the Kruskal-Wallis test is a non-parametric rank-based alternative to one-way ANOVA for comparing distributions across three or more independent groups. Operationally, this study applied it to per-abstract hedge rates (hedges per 100 words) across the three disciplines. The test statistic is H = [12 / (N(N+1))] × Σ (Rⱼ² / nⱼ) − 3(N+1), where N is the total number of observations, nⱼ is the size of group j, and Rⱼ is the sum of ranks for group j. The reported result was H ≈ 7.39, p = .025.</w:t>
+        <w:t/>
       </w:r>
       <w:r>
         <w:rPr>
@@ -2579,7 +2579,7 @@
           <w:szCs w:val="22"/>
           <w:rtl w:val="0"/>
         </w:rPr>
-        <w:t xml:space="preserve">The Philippine higher education context is relevant because English is the official medium of academic writing instruction at PSAU despite being a second language for most of the population. In many Philippine undergraduate writing courses, including those that emphasize structure and grammatical correctness more than stance, hedging is seldom taught as a distinct rhetorical skill. Developing researchers writing thesis abstracts were therefore producing a genre that demanded hedging with limited explicit preparation for its epistemic requirements. These conditions made PSAU an appropriate institutional site for examining disciplinary hedging among developing researchers in a Philippine L2 context.</w:t>
+        <w:t xml:space="preserve">The Philippine higher education context is relevant because English is the official medium of academic writing instruction at PSAU despite being a second language for most of the population. At PSAU, undergraduate writing instruction in the programs sampled for this study emphasizes structure and grammatical correctness more than stance. Hedging is not treated as a distinct rhetorical skill in the course materials reviewed for this project. Developing researchers writing thesis abstracts were therefore producing a genre that demanded hedging with limited explicit preparation for its epistemic requirements. These conditions made PSAU an appropriate institutional site for examining disciplinary hedging among developing researchers in a Philippine L2 context.</w:t>
       </w:r>
       <w:r>
         <w:rPr>
@@ -2605,7 +2605,7 @@
           <w:szCs w:val="22"/>
           <w:rtl w:val="0"/>
         </w:rPr>
-        <w:t xml:space="preserve">The PSAU thesis guidelines available for this study prescribed standard formatting but did not set a rigid rhetorical template for abstracts. Observed hedging patterns are therefore read as negotiated textual choices within that formatting frame, not as products of a fixed institutional abstract script.</w:t>
+        <w:t xml:space="preserve">The PSAU thesis guidelines available for this study prescribed standard formatting but did not set a rigid rhetorical template for abstracts.</w:t>
       </w:r>
       <w:r>
         <w:rPr>
@@ -9734,7 +9734,7 @@
           <w:sz w:val="22"/>
           <w:szCs w:val="22"/>
         </w:rPr>
-        <w:t>Per-abstract hedge distributions reveal substantial skew. Agriculture abstracts averaged 1.35 hedges (median = 1, SD = 1.84, range = 0–8), Biology averaged 1.40 (median = 1, SD = 1.31, range = 0–5), and Veterinary Medicine averaged 0.50 (median = 0, SD = 0.76, range = 0–3). The high standard deviation in Agriculture reflects the influence of Acs2, which contained 8 hedges alone. When Acs2 is excluded as a sensitivity check, Agriculture's density drops to 0.46 per 100 words, below Biology's 0.62, suggesting that the Agriculture &gt; Biology ranking is partly driven by a single outlier abstract. An exploratory Kruskal-Wallis test on per-abstract hedge rates (per 100 words) yielded H ≈ 7.39, p = .025. Post hoc Mann-Whitney tests on the same rates give Veterinary Medicine versus Biology p = .011, Veterinary Medicine versus Agriculture p = .034, and Agriculture versus Biology p = .72. With a Bonferroni correction for three pairwise tests (α = .017), only the Biology–Veterinary Medicine contrast remains significant. Agriculture and Biology are statistically indistinguishable on this measure. Veterinary Medicine is the field that differs. Abstracts within a program may share advisers, so observations are not fully independent, and within-discipline spread remains larger than the gaps between means. With a small, zero-inflated sample, the Kruskal-Wallis result and the pairwise follow-ups are treated as exploratory. A sensitivity check that removes all 19 instances of "potential" leaves 46 hedges. The Kruskal-Wallis contrast remains in the same direction, and Veterinary Medicine’s zero-hedge share rises further. The same directional pattern holds without those tokens.</w:t>
+        <w:t xml:space="preserve">Per-abstract hedge distributions reveal substantial skew. Agriculture abstracts averaged 1.35 hedges (median = 1, SD = 1.84, range = 0–8), Biology averaged 1.40 (median = 1, SD = 1.31, range = 0–5), and Veterinary Medicine averaged 0.50 (median = 0, SD = 0.76, range = 0–3). The high standard deviation in Agriculture reflects the influence of Acs2, which contained 8 hedges alone. When Acs2 is excluded as a sensitivity check, Agriculture's density drops to 0.46 per 100 words, below Biology's 0.62, suggesting that the Agriculture &gt; Biology ranking is partly driven by a single outlier abstract. An exploratory Kruskal-Wallis test on per-abstract hedge rates (per 100 words) yielded H = 7.44, p = .024. Post hoc Mann-Whitney tests on the same rates give Veterinary Medicine versus Biology p = .011, Veterinary Medicine versus Agriculture p = .034, and Agriculture versus Biology p = .72. With a Bonferroni correction for three pairwise tests (α = .017), only the Biology–Veterinary Medicine contrast remains significant. Agriculture and Biology are statistically indistinguishable on this measure. Veterinary Medicine is the field that differs. Abstracts within a program may share advisers, so observations are not fully independent, and within-discipline spread remains larger than the gaps between means. With a small, zero-inflated sample, the Kruskal-Wallis result and the pairwise follow-ups are treated as exploratory. A sensitivity check that removes all 19 instances of "potential" leaves 46 hedges. The Kruskal-Wallis contrast remains in the same direction, and Veterinary Medicine’s zero-hedge share rises further. The same directional pattern holds without those tokens.</w:t>
       </w:r>
       <w:r>
         <w:rPr>
@@ -10484,7 +10484,7 @@
           <w:szCs w:val="22"/>
           <w:rtl w:val="0"/>
         </w:rPr>
-        <w:t>Most hedges fall in implication and conclusion sentences rather than in direct results reporting. Forms such as potential and suggest/suggests/suggesting typically frame applications or interpretations, while results sentences more often use factive verbs (showed, revealed, demonstrated) without qualification. A formal move-structured count was not performed. This remains a qualitative pattern.</w:t>
+        <w:t xml:space="preserve">Most hedges in this corpus fall in implication and conclusion sentences rather than in direct results reporting. Forms such as potential and suggest/suggests/suggesting typically frame applications or interpretations. Results sentences in the same abstracts often use factive verbs (showed, revealed, demonstrated) without qualification. A formal move-structured count was not performed. This remains a qualitative pattern within the present sample.</w:t>
       </w:r>
       <w:r>
         <w:rPr>
@@ -10559,7 +10559,7 @@
           <w:sz w:val="22"/>
           <w:szCs w:val="22"/>
         </w:rPr>
-        <w:t xml:space="preserve">Parts I through III map frequency, function, and cross-disciplinary density. The contrasts below describe what was observed in this corpus. They are not presented as stable discipline-level characteristics. Inferential tests are exploratory, as stated in Scope and Limitations. As reported in Part II, the Kruskal-Wallis test on rates reached p = .025. Pairwise Mann-Whitney tests with Bonferroni correction leave only the Biology–Veterinary Medicine contrast significant. The chi-square on zero-hedge rates was p = .079. Generalization beyond this corpus is not warranted. The patterns are read through Salager-Meyer’s (1994) claim-responsibility framework and Hyland’s (2005) stance model.</w:t>
+        <w:t xml:space="preserve">Parts I through III map frequency, function, and cross-disciplinary density. The contrasts below describe what was observed in this corpus. They are not presented as stable discipline-level characteristics. Inferential tests are exploratory, as stated in Scope and Limitations. As reported in Part II, the Kruskal-Wallis test on rates reached p = .024. Pairwise Mann-Whitney tests with Bonferroni correction leave only the Biology–Veterinary Medicine contrast significant. The chi-square on zero-hedge rates was p = .079. Generalization beyond this corpus is not warranted. The patterns are read through Salager-Meyer’s (1994) claim-responsibility framework and Hyland’s (2005) stance model.</w:t>
       </w:r>
     </w:p>
     <w:p>
@@ -11560,7 +11560,7 @@
           <w:sz w:val="22"/>
           <w:szCs w:val="22"/>
         </w:rPr>
-        <w:t xml:space="preserve">Limited evidence of disciplinary differentiation, mainly Veterinary Medicine’s lower density. Agriculture’s edge over Biology is modest and outlier-sensitive. Acs2 illustrates rescue-hedging after a non-significant result, which links to the introduction’s concern with overclaiming, but it is a single abstract. The Null/NS mean in Agriculture falls to the same level as non-Null Agriculture once Acs2 is removed. The data cannot separate field norms, adviser practice, and outcome type. Agriculture has no Binary outcomes here, so discipline and study design remain entangled. The Kruskal-Wallis test on rates was p = .025. Pairwise Mann-Whitney tests with Bonferroni correction leave Biology–Veterinary Medicine as the surviving contrast. Those tests are exploratory and the sample is small, as noted in Scope. The study provides a local baseline: VM abstracts in this corpus hedge less. The causes remain unknown.</w:t>
+        <w:t xml:space="preserve">Limited evidence of disciplinary differentiation, mainly Veterinary Medicine’s lower density. Agriculture’s edge over Biology is modest and outlier-sensitive. Acs2 illustrates rescue-hedging after a non-significant result, which links to the introduction’s concern with overclaiming, but it is a single abstract. The Null/NS mean in Agriculture falls to the same level as non-Null Agriculture once Acs2 is removed. The data cannot separate field norms, adviser practice, and outcome type. Agriculture has no Binary outcomes here, so discipline and study design remain entangled. The Kruskal-Wallis test on rates was p = .024. Pairwise Mann-Whitney tests with Bonferroni correction leave Biology–Veterinary Medicine as the surviving contrast. Those tests are exploratory and the sample is small, as noted in Scope. The study provides a local baseline: VM abstracts in this corpus hedge less. The causes remain unknown.</w:t>
       </w:r>
       <w:r>
         <w:rPr>
@@ -25548,7 +25548,7 @@
           <w:strike w:val="0"/>
           <w:color w:val="000000"/>
         </w:rPr>
-        <w:t xml:space="preserve">This study determined the hematological and electrolyte values of island-born New Zealand White (NZW) rabbits (Oryctolagus cuniculus). Eight (8) adult rabbits (4 female and 4 male) with initial weight between 2.5 to 2.7kgs were used for sample collection. Around 3.0 ml and 0.5 ml of blood was collected from the central auricular artery and the lateral saphenous vein, respectively of each rabbit. Hematological tests for packed cell volume (PCV), red blood cells (RBC), hemoglobin (HGB), mean corpuscular hemoglobin (MCH), mean corpuscular hemoglobin concentration (MCHC), mean corpuscular volume (MCV), white blood cells (WBC), neutrophils, eosinophils, lymphocytes, monocytes, and serum electrolyte tests for sodium (Na), potassium (K), magnesium (Mg), and calcium (Ca) were requested from Hi-Precision Diagnostics Laboratory. Results were gathered and mean values were determined using MS Excel and subjected to statistical analysis using t-test through statistical package for the social sciences (SPSS). The mean values of each hematological parameter of male and female rabbits, respectively were: PCV (37.32% and 37.4%); RBC (5.91x106/mm3 and 5.76x106/mm3); HGB (12.32g/dL and 12.37g/dL); MCH (20.63pg and 21.47pg); MCHC (33.03% and 32.90%); MCV (62.57fL and 64.52fL); WBC (7.39x109/L and 8.17x109/L); neutrophils (43.30% and 51.85%); eosinophils (0.10% and 0.10%); lymphocytes (52.47% and 41.22%); monocytes (2.18% and 4.61%); and basophils (1.94% and 2.21%). The mean values of each electrolyte parameter of male and female rabbits, respectively were: sodium (140.25mmol/L and 143.25mmol/L); potassium (4.32mmol/L and 4.37mmol/L); magnesium (0.87mmol/L and 0.98mmol/L); and calcium (3.41mmol/L and 3.21mmol/L). </w:t>
+        <w:t xml:space="preserve">This study determined the hematological and electrolyte values of island-born New Zealand White (NZW) rabbits (Oryctolagus cuniculus). Eight (8) adult rabbits (4 female and 4 male) with initial weight between 2.5 to 2.7kgs were used for sample collection. Around 3.0 ml and 0.5 ml of blood was collected from the central auricular artery and the lateral saphenous vein, respectively of each rabbit. Hematological tests for packed cell volume (PCV), red blood cells (RBC), hemoglobin (HGB), mean corpuscular hemoglobin (MCH), mean corpuscular hemoglobin concentration (MCHC), mean corpuscular volume (MCV), white blood cells (WBC), neutrophils, eosinophils, lymphocytes, monocytes, and serum electrolyte tests for sodium (Na), potassium (K), magnesium (Mg), and calcium (Ca) were requested from Hi-Precision Diagnostics Laboratory. Results were gathered and mean values were determined using MS Excel and subjected to statistical analysis using t-test through statistical package for the social sciences (SPSS). The mean values of each hematological parameter of male and female rabbits, respectively were: PCV (37.32% and 37.4%); RBC (5.91x106/mm3 and 5.76x106/mm3); HGB (12.32g/dL and 12.37g/dL); MCH (20.63pg and 21.47pg); MCHC (33.03% and 32.90%); MCV (62.57fL and 64.52fL); WBC (7.39x109/L and 8.17x109/L); neutrophils (43.30% and 51.85%); eosinophils (0.10% and 0.10%); lymphocytes (52.47% and 41.22%); monocytes (2.18% and 4.61%); and basophils (1.94% and 2.21%). The mean values of each electrolyte parameter of male and female rabbits, respectively were: sodium (140.25mmol/L and 143.25mmol/L); potassium (4.32mmol/L and 4.37mmol/L); magnesium (0.87mmol/L and 0.98mmol/L); and calcium (3.41mmol/L and 3.21mmol/L). Mean values for PCV, RBC, HGB, MCH, MCHC, MCV, WBC, neutrophils, eosinophils, lymphocytes, monocytes, basophils, potassium, magnesium, and calcium were not significantly different while mean values for sodium between male and female NZW rabbits were found to be statistically different (p&lt;0.05). [R]</w:t>
       </w:r>
       <w:r>
         <w:rPr>
@@ -25561,7 +25561,7 @@
           <w:shd w:val="clear" w:fill="BFBFBF"/>
           <w:color w:val="000000"/>
         </w:rPr>
-        <w:t>Mean values for PCV, RBC, HGB, MCH, MCHC, MCV, WBC, neutrophils, eosinophils, lymphocytes, monocytes, basophils, potassium, magnesium, and calcium were not significantly different while mean values for sodium between male and female NZW rabbits were found to be statistically different (p&lt;0.05).</w:t>
+        <w:t/>
       </w:r>
       <w:r>
         <w:rPr>
@@ -25573,7 +25573,7 @@
           <w:strike w:val="0"/>
           <w:color w:val="000000"/>
         </w:rPr>
-        <w:t xml:space="preserve"> [R]</w:t>
+        <w:t xml:space="preserve"/>
       </w:r>
     </w:p>
     <w:p>

</xml_diff>

<commit_message>
Draft_054: fold bold spill fixes (no new draft for stylistic change)
Repo practice: new draft numbers for major content revisions only.
Bold lead-clause fixes from former 055 applied on Draft_054; 055 removed.
</commit_message>
<xml_diff>
--- a/thesis/003_ThesisProposal_Draft_054.docx
+++ b/thesis/003_ThesisProposal_Draft_054.docx
@@ -2882,25 +2882,21 @@
       </w:pPr>
       <w:r>
         <w:rPr>
-          <w:rFonts w:ascii="Georgia" w:hAnsi="Georgia" w:cs="Georgia" w:eastAsia="Georgia"/>
+          <w:rFonts w:ascii="Georgia" w:hAnsi="Georgia"/>
+          <w:sz w:val="22"/>
+          <w:szCs w:val="22"/>
           <w:b/>
           <w:bCs/>
-          <w:sz w:val="22"/>
-        </w:rPr>
-        <w:t xml:space="preserve">e. Data Analysis. Hedge identification, type classification, and functional coding were all conducted manually using a Google Sheets coding template. Each abstract was read in full before coding began to ensure hedges were interpreted in context rather than flagged as isolated tokens. Ambiguous cases were resolved using the predefined decision tree in Appendix A. Frequency counts were normalized per 100 words to enable comparison across abstracts of varying length. In a separate pass, each abstract was also coded for outcome type from its results language (Binary, Continuous, Mixed, Null/NS, Other), so that density patterns could be read against the kind of finding reported. Those codes are recorded in the coding spreadsheet and discussed in Part IV. While the quantitative analysis identified what hedges were used, the qualitative interpretation applied Salager-Meyer’s (1994) claim-responsibility framework and Hyland’s (2005) stance model to explain why these patterns occurred. Given the corpus size, findings were interpreted as indicative patterns within the PSAU context, supplemented by inferential analyses (chi-square, Kruskal-Wallis) whose results are reported transparently but should not be treated as confirmatory given the small, zero-inflated sample.</w:t>
-      </w:r>
-      <w:r>
-        <w:rPr>
-          <w:rFonts w:ascii="Georgia" w:hAnsi="Georgia" w:cs="Georgia" w:eastAsia="Georgia"/>
-          <w:i w:val="0"/>
-          <w:iCs w:val="0"/>
-          <w:sz w:val="22"/>
-          <w:szCs w:val="22"/>
-          <w:rtl w:val="0"/>
-          <w:b w:val="0"/>
-          <w:bCs w:val="0"/>
-        </w:rPr>
-        <w:t/>
+        </w:rPr>
+        <w:t xml:space="preserve">e. Data Analysis. </w:t>
+      </w:r>
+      <w:r>
+        <w:rPr>
+          <w:rFonts w:ascii="Georgia" w:hAnsi="Georgia"/>
+          <w:sz w:val="22"/>
+          <w:szCs w:val="22"/>
+        </w:rPr>
+        <w:t xml:space="preserve">Hedge identification, type classification, and functional coding were all conducted manually using a Google Sheets coding template. Each abstract was read in full before coding began to ensure hedges were interpreted in context rather than flagged as isolated tokens. Ambiguous cases were resolved using the predefined decision tree in Appendix A. Frequency counts were normalized per 100 words to enable comparison across abstracts of varying length. In a separate pass, each abstract was also coded for outcome type from its results language (Binary, Continuous, Mixed, Null/NS, Other), so that density patterns could be read against the kind of finding reported. Those codes are recorded in the coding spreadsheet and discussed in Part IV. While the quantitative analysis identified what hedges were used, the qualitative interpretation applied Salager-Meyer’s (1994) claim-responsibility framework and Hyland’s (2005) stance model to explain why these patterns occurred. Given the corpus size, findings were interpreted as indicative patterns within the PSAU context, supplemented by inferential analyses (chi-square, Kruskal-Wallis) whose results are reported transparently but should not be treated as confirmatory given the small, zero-inflated sample.</w:t>
       </w:r>
     </w:p>
     <w:p>
@@ -4286,21 +4282,21 @@
       </w:pPr>
       <w:r>
         <w:rPr>
-          <w:rFonts w:ascii="Georgia" w:cs="Georgia" w:eastAsia="Georgia" w:hAnsi="Georgia"/>
-          <w:b w:val="0"/>
-          <w:bCs w:val="0"/>
-          <w:i w:val="0"/>
-          <w:iCs w:val="0"/>
-          <w:sz w:val="22"/>
-          <w:szCs w:val="22"/>
-          <w:rtl w:val="0"/>
-        </w:rPr>
-        <w:t>Inclusion Criteria. English-language undergraduate thesis abstracts. Complete abstracts available in the PSAU library archives. Clear disciplinary classification based on official degree program. Hard-bound submission year (as recorded in the PSAU library catalog) between 2023 and 2025.</w:t>
-      </w:r>
-      <w:r>
-        <w:rPr>
-          <w:rtl w:val="0"/>
-        </w:rPr>
+          <w:rFonts w:ascii="Georgia" w:hAnsi="Georgia"/>
+          <w:sz w:val="22"/>
+          <w:szCs w:val="22"/>
+          <w:b/>
+          <w:bCs/>
+        </w:rPr>
+        <w:t xml:space="preserve">Inclusion Criteria. </w:t>
+      </w:r>
+      <w:r>
+        <w:rPr>
+          <w:rFonts w:ascii="Georgia" w:hAnsi="Georgia"/>
+          <w:sz w:val="22"/>
+          <w:szCs w:val="22"/>
+        </w:rPr>
+        <w:t xml:space="preserve">English-language undergraduate thesis abstracts. Complete abstracts available in the PSAU library archives. Clear disciplinary classification based on official degree program. Hard-bound submission year (as recorded in the PSAU library catalog) between 2023 and 2025.</w:t>
       </w:r>
     </w:p>
     <w:p>
@@ -4312,21 +4308,21 @@
       </w:pPr>
       <w:r>
         <w:rPr>
-          <w:rFonts w:ascii="Georgia" w:cs="Georgia" w:eastAsia="Georgia" w:hAnsi="Georgia"/>
-          <w:b w:val="0"/>
-          <w:bCs w:val="0"/>
-          <w:i w:val="0"/>
-          <w:iCs w:val="0"/>
-          <w:sz w:val="22"/>
-          <w:szCs w:val="22"/>
-          <w:rtl w:val="0"/>
-        </w:rPr>
-        <w:t>Exclusion Criteria. Non-English abstracts or abstracts with significant Filipino code-switching. Graduate-level theses. Theses submitted under interdisciplinary degree programs (e.g., Environmental Science) where a single disciplinary affiliation cannot be determined. Theses whose hard-bound submission year (library catalog) is before 2023.</w:t>
-      </w:r>
-      <w:r>
-        <w:rPr>
-          <w:rtl w:val="0"/>
-        </w:rPr>
+          <w:rFonts w:ascii="Georgia" w:hAnsi="Georgia"/>
+          <w:sz w:val="22"/>
+          <w:szCs w:val="22"/>
+          <w:b/>
+          <w:bCs/>
+        </w:rPr>
+        <w:t xml:space="preserve">Exclusion Criteria. </w:t>
+      </w:r>
+      <w:r>
+        <w:rPr>
+          <w:rFonts w:ascii="Georgia" w:hAnsi="Georgia"/>
+          <w:sz w:val="22"/>
+          <w:szCs w:val="22"/>
+        </w:rPr>
+        <w:t xml:space="preserve">Non-English abstracts or abstracts with significant Filipino code-switching. Graduate-level theses. Theses submitted under interdisciplinary degree programs (e.g., Environmental Science) where a single disciplinary affiliation cannot be determined. Theses whose hard-bound submission year (library catalog) is before 2023.</w:t>
       </w:r>
     </w:p>
     <w:p>
@@ -4346,33 +4342,21 @@
       </w:pPr>
       <w:r>
         <w:rPr>
-          <w:rFonts w:ascii="Georgia" w:hAnsi="Georgia" w:cs="Georgia" w:eastAsia="Georgia"/>
-          <w:b w:val="0"/>
-          <w:bCs w:val="1"/>
-          <w:i w:val="0"/>
-          <w:iCs w:val="0"/>
-          <w:rtl w:val="0"/>
-          <w:sz w:val="22"/>
-          <w:szCs w:val="22"/>
-        </w:rPr>
-        <w:t>Ethical Considerations. Abstracts were accessed on-site at the PSAU Library with proper authorization. Student names were fully anonymized using discipline codes (Acs1–Acs10, Aas1–Aas10, VM1–VM20, B1–B20) before analysis began. Thesis titles that appear as quoted wording inside an abstract (source text) were redacted in the coded appendix where they identified the work. Residual title fragments, if any, do not include student names. The study analyzed linguistic patterns in text, not student performance or personal information. All data files were stored on password-protected devices and encrypted cloud storage accessible only to the researcher and thesis adviser. These files are retained for five years to support verification of coding decisions by future researchers and to allow for follow-up comparative studies, after which they are permanently deleted in line with standard academic data retention practice.</w:t>
-      </w:r>
-      <w:r>
-        <w:rPr>
-          <w:rFonts w:ascii="Georgia" w:cs="Georgia" w:eastAsia="Georgia" w:hAnsi="Georgia"/>
-          <w:b w:val="0"/>
-          <w:bCs w:val="0"/>
-          <w:i w:val="0"/>
-          <w:iCs w:val="0"/>
-          <w:sz w:val="22"/>
-          <w:szCs w:val="22"/>
-          <w:rtl w:val="0"/>
-        </w:rPr>
-      </w:r>
-      <w:r>
-        <w:rPr>
-          <w:rtl w:val="0"/>
-        </w:rPr>
+          <w:rFonts w:ascii="Georgia" w:hAnsi="Georgia"/>
+          <w:sz w:val="22"/>
+          <w:szCs w:val="22"/>
+          <w:b/>
+          <w:bCs/>
+        </w:rPr>
+        <w:t xml:space="preserve">Ethical Considerations. </w:t>
+      </w:r>
+      <w:r>
+        <w:rPr>
+          <w:rFonts w:ascii="Georgia" w:hAnsi="Georgia"/>
+          <w:sz w:val="22"/>
+          <w:szCs w:val="22"/>
+        </w:rPr>
+        <w:t xml:space="preserve">Abstracts were accessed on-site at the PSAU Library with proper authorization. Student names were fully anonymized using discipline codes (Acs1–Acs10, Aas1–Aas10, VM1–VM20, B1–B20) before analysis began. Thesis titles that appear as quoted wording inside an abstract (source text) were redacted in the coded appendix where they identified the work. Residual title fragments, if any, do not include student names. The study analyzed linguistic patterns in text, not student performance or personal information. All data files were stored on password-protected devices and encrypted cloud storage accessible only to the researcher and thesis adviser. These files are retained for five years to support verification of coding decisions by future researchers and to allow for follow-up comparative studies, after which they are permanently deleted in line with standard academic data retention practice.</w:t>
       </w:r>
     </w:p>
     <w:p>

</xml_diff>

<commit_message>
Draft_054: fix remaining Definition bold spills (KW, Mann-Whitney)
</commit_message>
<xml_diff>
--- a/thesis/003_ThesisProposal_Draft_054.docx
+++ b/thesis/003_ThesisProposal_Draft_054.docx
@@ -2158,34 +2158,21 @@
       </w:pPr>
       <w:r>
         <w:rPr>
-          <w:rFonts w:ascii="Georgia" w:hAnsi="Georgia" w:cs="Georgia" w:eastAsia="Georgia"/>
-          <w:i w:val="0"/>
-          <w:iCs w:val="0"/>
-          <w:sz w:val="22"/>
-          <w:szCs w:val="22"/>
-          <w:rtl w:val="0"/>
+          <w:rFonts w:ascii="Georgia" w:hAnsi="Georgia"/>
+          <w:sz w:val="22"/>
+          <w:szCs w:val="22"/>
           <w:b/>
           <w:bCs/>
         </w:rPr>
-        <w:t xml:space="preserve">Kruskal-Wallis Test, conceptually, the Kruskal-Wallis test is a non-parametric rank-based alternative to one-way ANOVA for comparing distributions across three or more independent groups. Operationally, this study applied it to per-abstract hedge rates (hedges per 100 words) across the three disciplines. The test statistic is H = [12 / (N(N+1))] × Σ (Rⱼ² / nⱼ) − 3(N+1), where N is the total number of observations, nⱼ is the size of group j, and Rⱼ is the sum of ranks for group j. The reported result was H = 7.44, p = .024.</w:t>
-      </w:r>
-      <w:r>
-        <w:rPr>
-          <w:rFonts w:ascii="Georgia" w:hAnsi="Georgia" w:cs="Georgia" w:eastAsia="Georgia"/>
-          <w:i w:val="0"/>
-          <w:iCs w:val="0"/>
-          <w:sz w:val="22"/>
-          <w:szCs w:val="22"/>
-          <w:rtl w:val="0"/>
-          <w:b w:val="0"/>
-          <w:bCs w:val="0"/>
-        </w:rPr>
-        <w:t/>
-      </w:r>
-      <w:r>
-        <w:rPr>
-          <w:rtl w:val="0"/>
-        </w:rPr>
+        <w:t xml:space="preserve">Kruskal-Wallis Test, </w:t>
+      </w:r>
+      <w:r>
+        <w:rPr>
+          <w:rFonts w:ascii="Georgia" w:hAnsi="Georgia"/>
+          <w:sz w:val="22"/>
+          <w:szCs w:val="22"/>
+        </w:rPr>
+        <w:t xml:space="preserve">conceptually, the Kruskal-Wallis test is a non-parametric rank-based alternative to one-way ANOVA for comparing distributions across three or more independent groups. Operationally, this study applied it to per-abstract hedge rates (hedges per 100 words) across the three disciplines. The test statistic is H = [12 / (N(N+1))] × Σ (Rⱼ² / nⱼ) − 3(N+1), where N is the total number of observations, nⱼ is the size of group j, and Rⱼ is the sum of ranks for group j. The reported result was H = 7.44, p = .024.</w:t>
       </w:r>
     </w:p>
     <w:p>
@@ -2236,23 +2223,21 @@
       </w:pPr>
       <w:r>
         <w:rPr>
-          <w:rFonts w:ascii="Georgia" w:hAnsi="Georgia" w:cs="Georgia" w:eastAsia="Georgia"/>
+          <w:rFonts w:ascii="Georgia" w:hAnsi="Georgia"/>
           <w:sz w:val="22"/>
           <w:szCs w:val="22"/>
           <w:b/>
           <w:bCs/>
         </w:rPr>
-        <w:t xml:space="preserve">Mann-Whitney U Test, conceptually, the Mann-Whitney U test (also called the Wilcoxon rank-sum test) is a non-parametric test that compares the distributions of a continuous or ordinal variable between two independent groups. Operationally, this study used it as a post hoc follow-up after the Kruskal-Wallis test, comparing per-abstract hedge rates (hedges per 100 words) for each pair of disciplines. The test statistic is U = n₁n₂ + [n₁(n₁+1)]/2 − R₁, where n₁ and n₂ are the sample sizes of the two groups and R₁ is the sum of ranks for group 1. A Bonferroni correction for three pairwise tests set α = .017. The reported results were Veterinary Medicine versus Biology p = .011, Veterinary Medicine versus Agriculture p = .034, and Agriculture versus Biology p = .72. Only the Biology–Veterinary Medicine contrast remained significant after correction.</w:t>
-      </w:r>
-      <w:r>
-        <w:rPr>
-          <w:rFonts w:ascii="Georgia" w:hAnsi="Georgia" w:cs="Georgia" w:eastAsia="Georgia"/>
-          <w:sz w:val="22"/>
-          <w:szCs w:val="22"/>
-          <w:b w:val="0"/>
-          <w:bCs w:val="0"/>
-        </w:rPr>
-        <w:t/>
+        <w:t xml:space="preserve">Mann-Whitney U Test, </w:t>
+      </w:r>
+      <w:r>
+        <w:rPr>
+          <w:rFonts w:ascii="Georgia" w:hAnsi="Georgia"/>
+          <w:sz w:val="22"/>
+          <w:szCs w:val="22"/>
+        </w:rPr>
+        <w:t xml:space="preserve">conceptually, the Mann-Whitney U test (also called the Wilcoxon rank-sum test) is a non-parametric test that compares the distributions of a continuous or ordinal variable between two independent groups. Operationally, this study used it as a post hoc follow-up after the Kruskal-Wallis test, comparing per-abstract hedge rates (hedges per 100 words) for each pair of disciplines. The test statistic is U = n₁n₂ + [n₁(n₁+1)]/2 − R₁, where n₁ and n₂ are the sample sizes of the two groups and R₁ is the sum of ranks for group 1. A Bonferroni correction for three pairwise tests set α = .017. The reported results were Veterinary Medicine versus Biology p = .011, Veterinary Medicine versus Agriculture p = .034, and Agriculture versus Biology p = .72. Only the Biology–Veterinary Medicine contrast remained significant after correction.</w:t>
       </w:r>
     </w:p>
     <w:p>

</xml_diff>

<commit_message>
Draft_054: full bold audit; unbold Table 2 Total row for consistency
</commit_message>
<xml_diff>
--- a/thesis/003_ThesisProposal_Draft_054.docx
+++ b/thesis/003_ThesisProposal_Draft_054.docx
@@ -6891,7 +6891,6 @@
             <w:r>
               <w:rPr>
                 <w:rFonts w:ascii="Georgia" w:hAnsi="Georgia" w:cs="Georgia" w:eastAsia="Georgia"/>
-                <w:b/>
                 <w:sz w:val="22"/>
               </w:rPr>
               <w:t>Total</w:t>
@@ -6916,7 +6915,6 @@
             <w:r>
               <w:rPr>
                 <w:rFonts w:ascii="Georgia" w:hAnsi="Georgia" w:cs="Georgia" w:eastAsia="Georgia"/>
-                <w:b/>
                 <w:sz w:val="22"/>
               </w:rPr>
             </w:r>
@@ -6940,7 +6938,6 @@
             <w:r>
               <w:rPr>
                 <w:rFonts w:ascii="Georgia" w:hAnsi="Georgia" w:cs="Georgia" w:eastAsia="Georgia"/>
-                <w:b/>
                 <w:sz w:val="22"/>
               </w:rPr>
               <w:t>65</w:t>
@@ -6965,7 +6962,6 @@
             <w:r>
               <w:rPr>
                 <w:rFonts w:ascii="Georgia" w:hAnsi="Georgia" w:cs="Georgia" w:eastAsia="Georgia"/>
-                <w:b/>
                 <w:sz w:val="22"/>
               </w:rPr>
               <w:t>100.0%</w:t>

</xml_diff>

<commit_message>
Draft_054: fix VM6 unhedged grey highlight on claim text
</commit_message>
<xml_diff>
--- a/thesis/003_ThesisProposal_Draft_054.docx
+++ b/thesis/003_ThesisProposal_Draft_054.docx
@@ -25511,34 +25511,31 @@
           <w:b w:val="0"/>
           <w:bCs w:val="0"/>
           <w:strike w:val="0"/>
-          <w:color w:val="000000"/>
-        </w:rPr>
-        <w:t xml:space="preserve">This study determined the hematological and electrolyte values of island-born New Zealand White (NZW) rabbits (Oryctolagus cuniculus). Eight (8) adult rabbits (4 female and 4 male) with initial weight between 2.5 to 2.7kgs were used for sample collection. Around 3.0 ml and 0.5 ml of blood was collected from the central auricular artery and the lateral saphenous vein, respectively of each rabbit. Hematological tests for packed cell volume (PCV), red blood cells (RBC), hemoglobin (HGB), mean corpuscular hemoglobin (MCH), mean corpuscular hemoglobin concentration (MCHC), mean corpuscular volume (MCV), white blood cells (WBC), neutrophils, eosinophils, lymphocytes, monocytes, and serum electrolyte tests for sodium (Na), potassium (K), magnesium (Mg), and calcium (Ca) were requested from Hi-Precision Diagnostics Laboratory. Results were gathered and mean values were determined using MS Excel and subjected to statistical analysis using t-test through statistical package for the social sciences (SPSS). The mean values of each hematological parameter of male and female rabbits, respectively were: PCV (37.32% and 37.4%); RBC (5.91x106/mm3 and 5.76x106/mm3); HGB (12.32g/dL and 12.37g/dL); MCH (20.63pg and 21.47pg); MCHC (33.03% and 32.90%); MCV (62.57fL and 64.52fL); WBC (7.39x109/L and 8.17x109/L); neutrophils (43.30% and 51.85%); eosinophils (0.10% and 0.10%); lymphocytes (52.47% and 41.22%); monocytes (2.18% and 4.61%); and basophils (1.94% and 2.21%). The mean values of each electrolyte parameter of male and female rabbits, respectively were: sodium (140.25mmol/L and 143.25mmol/L); potassium (4.32mmol/L and 4.37mmol/L); magnesium (0.87mmol/L and 0.98mmol/L); and calcium (3.41mmol/L and 3.21mmol/L). Mean values for PCV, RBC, HGB, MCH, MCHC, MCV, WBC, neutrophils, eosinophils, lymphocytes, monocytes, basophils, potassium, magnesium, and calcium were not significantly different while mean values for sodium between male and female NZW rabbits were found to be statistically different (p&lt;0.05). [R]</w:t>
-      </w:r>
-      <w:r>
-        <w:rPr>
-          <w:rFonts w:ascii="Georgia" w:hAnsi="Georgia" w:cs="Georgia" w:eastAsia="Georgia"/>
-          <w:sz w:val="22"/>
-          <w:szCs w:val="22"/>
-          <w:b w:val="0"/>
-          <w:bCs w:val="0"/>
-          <w:strike w:val="0"/>
-          <w:shd w:val="clear" w:fill="BFBFBF"/>
-          <w:color w:val="000000"/>
-        </w:rPr>
-        <w:t/>
-      </w:r>
-      <w:r>
-        <w:rPr>
-          <w:rFonts w:ascii="Georgia" w:hAnsi="Georgia" w:cs="Georgia" w:eastAsia="Georgia"/>
-          <w:sz w:val="20"/>
-          <w:szCs w:val="20"/>
-          <w:b w:val="0"/>
-          <w:bCs w:val="0"/>
-          <w:strike w:val="0"/>
-          <w:color w:val="000000"/>
-        </w:rPr>
-        <w:t xml:space="preserve"/>
+        </w:rPr>
+        <w:t xml:space="preserve">This study determined the hematological and electrolyte values of island-born New Zealand White (NZW) rabbits (Oryctolagus cuniculus). Eight (8) adult rabbits (4 female and 4 male) with initial weight between 2.5 to 2.7kgs were used for sample collection. Around 3.0 ml and 0.5 ml of blood was collected from the central auricular artery and the lateral saphenous vein, respectively of each rabbit. Hematological tests for packed cell volume (PCV), red blood cells (RBC), hemoglobin (HGB), mean corpuscular hemoglobin (MCH), mean corpuscular hemoglobin concentration (MCHC), mean corpuscular volume (MCV), white blood cells (WBC), neutrophils, eosinophils, lymphocytes, monocytes, and serum electrolyte tests for sodium (Na), potassium (K), magnesium (Mg), and calcium (Ca) were requested from Hi-Precision Diagnostics Laboratory. Results were gathered and mean values were determined using MS Excel and subjected to statistical analysis using t-test through statistical package for the social sciences (SPSS). The mean values of each hematological parameter of male and female rabbits, respectively were: PCV (37.32% and 37.4%); RBC (5.91x106/mm3 and 5.76x106/mm3); HGB (12.32g/dL and 12.37g/dL); MCH (20.63pg and 21.47pg); MCHC (33.03% and 32.90%); MCV (62.57fL and 64.52fL); WBC (7.39x109/L and 8.17x109/L); neutrophils (43.30% and 51.85%); eosinophils (0.10% and 0.10%); lymphocytes (52.47% and 41.22%); monocytes (2.18% and 4.61%); and basophils (1.94% and 2.21%). The mean values of each electrolyte parameter of male and female rabbits, respectively were: sodium (140.25mmol/L and 143.25mmol/L); potassium (4.32mmol/L and 4.37mmol/L); magnesium (0.87mmol/L and 0.98mmol/L); and calcium (3.41mmol/L and 3.21mmol/L). </w:t>
+      </w:r>
+      <w:r>
+        <w:rPr>
+          <w:rFonts w:ascii="Georgia" w:hAnsi="Georgia" w:cs="Georgia" w:eastAsia="Georgia"/>
+          <w:sz w:val="22"/>
+          <w:szCs w:val="22"/>
+          <w:b w:val="0"/>
+          <w:bCs w:val="0"/>
+          <w:strike w:val="0"/>
+          <w:shd w:val="clear" w:color="auto" w:fill="BFBFBF"/>
+        </w:rPr>
+        <w:t xml:space="preserve">Mean values for PCV, RBC, HGB, MCH, MCHC, MCV, WBC, neutrophils, eosinophils, lymphocytes, monocytes, basophils, potassium, magnesium, and calcium were not significantly different while mean values for sodium between male and female NZW rabbits were found to be statistically different (p&lt;0.05).</w:t>
+      </w:r>
+      <w:r>
+        <w:rPr>
+          <w:rFonts w:ascii="Georgia" w:hAnsi="Georgia" w:cs="Georgia" w:eastAsia="Georgia"/>
+          <w:sz w:val="22"/>
+          <w:szCs w:val="22"/>
+          <w:b w:val="0"/>
+          <w:bCs w:val="0"/>
+          <w:strike w:val="0"/>
+        </w:rPr>
+        <w:t xml:space="preserve"> [R]</w:t>
       </w:r>
     </w:p>
     <w:p>

</xml_diff>

<commit_message>
Draft_054: restore Appendix C wording to raw corpus (keep redactions + codes)
</commit_message>
<xml_diff>
--- a/thesis/003_ThesisProposal_Draft_054.docx
+++ b/thesis/003_ThesisProposal_Draft_054.docx
@@ -21625,7 +21625,7 @@
           <w:strike w:val="0"/>
           <w:color w:val="000000"/>
         </w:rPr>
-        <w:t xml:space="preserve">This study was conducted at the Research Extension and Technology (RET) and Microbiology Laboratory of the College of Arts and Sciences of Pampanga State Agricultural University from November 2018 - January 2019. [Conducted 2018–2019; bound and catalogued 2023 per library records] The study aims to determine the antibacterial activity of the Partial Fractions of Balitbitan (Cynometra ramiflora) against selected bacterial pathogens, Staphylococcus aureus and Escherichia coli. In the preliminary Kupchan method of Partitioning, the ethanolic extract of Balitbitan (Cynometra ramiflora) was partitioned to three solvents which are Hexane, Methanol and DCM and concentrated using a rotary evaporator at low temperature (30°C) and pressure. In the antibacterial testing, the paper disc diffusion method is used in order to </w:t>
+        <w:t xml:space="preserve">This study was conducted at the Research Extension and Technology (RET) and Microbiology Laboratory of the College of Arts and Sciences of Pampanga State Agricultural University from November 2018 - January 2019. The study aims to determine the antibacterial activity of the Partial Fractions of Balitbitan (Cynometra ramiflora) against selected bacterial pathogens, Staphylococcus aureus and Escherichia coli. In the preliminary Kupchan method of Partitioning, the ethanolic extract of Balitbitan (Cynometra ramiflora) was partitioned to three solvents which are Hexane, Methanol and DCM and concentrated using a rotary evaporator at low temperature (30°C) and pressure. In the antibacterial testing, the paper disc diffusion method is used in order to </w:t>
       </w:r>
       <w:r>
         <w:rPr>
@@ -22997,7 +22997,7 @@
           <w:strike w:val="0"/>
           <w:color w:val="000000"/>
         </w:rPr>
-        <w:t xml:space="preserve">It is well recognized that heavy metals harm human health through the food chain. The danger to human health associated with consuming fish contaminated with heavy metals were assessed. This study aimed to determine the presence of lead in the flesh part of selected fish species, Common carp (Cyprinus carpio), Roho labeo (Labeo rohita), and Silver carp (Hypophthalmichthys molitrix), in addition to determine the Knowledge, Attitude, and Practices (KAP) of fishers along the Pampanga River. A test method used is Inductively Coupled Plasma–Optical Emission Spectrometry (ICP-OES) in identifying heavy metals in biota. The self-administered questionnaires were distributed to 20 respondents, questionnaires compromised of socio-demographic characteristics and the KAP’s of fishers along the Pampanga River. Data analyses were done using SPSS (version 23). Data were explored using descriptive statistics. The results show that lead in any of the selected fish, with a &lt;0.013 mg/kg result is below the FAO and WHO’s allowed limits of 2 mg/kg and 0.5 mg/kg, respectively. Based on the result from KAP Analysis, knowledge scored M=1.7200 with SD equivalent to 0.10052 which is interpreted as poor knowledge. The attitude score M=3.1150 and SD=0.093330 which means a moderate attitude and lastly, practices score M = 2.8850 and SD = .13485 which is equivalent to have good practices. Thus, the researcher provided a policy proposal to focus on issues that needed to be addressed in the community. In terms of practices, proper waste management </w:t>
+        <w:t xml:space="preserve">It is well recognized that heavy metals harm human health through the food chain. The danger to human health associated with consuming fish contaminated with heavy metals were assessed. This study aimed to determine the presence of lead in the flesh part of selected fish species, Common carp (Cyprinus carpio), Roho labeo (Labeo rohita), and Silver carp (Hypophthalmichthys molitrix), in addition to determine the Knowledge, Attitude, and Practices (KAP) of fishers along the Pampanga River. A test method used is Inductively Coupled Plasma — Optical Emission Spectrometry (ICP-OES) in identifying heavy metals in biota. The self-administered questionnaires were distributed to 20 respondents, questionnaires compromised of socio-demographic characteristics and the KAP’s of fishers along the Pampanga River. Data analyses were done using SPSS (version 23). Data were explored using descriptive statistics. The results show that lead in any of the selected fish, with a &lt;0.013 mg/kg result is below the FAO and WHO’s allowed limits of 2 mg/kg and 0.5 mg/kg, respectively. Based on the result from KAP Analysis, knowledge scored M=1.7200 with SD equivalent to 0.10052 which is interpreted as poor knowledge. The attitude score M=3.1150 and SD=0.093330 which means a moderate attitude and lastly, practices score M = 2.8850 and SD = .13485 which is equivalent to have good practices. Thus, the researcher provided a policy proposal to focus on issues that needed to be addressed in the community. In terms of practices, proper waste management </w:t>
       </w:r>
       <w:r>
         <w:rPr>
@@ -26289,7 +26289,7 @@
           <w:strike w:val="0"/>
           <w:color w:val="000000"/>
         </w:rPr>
-        <w:t xml:space="preserve">Humans and animals have historically utilized immunoglobulin Y (IgY), the most common kind of immunoglobulin generated by B cells in avian species, as a therapeutic treatment for passive immunity. This study was conducted to determine the immunogenicity of freeze-dried egg yolk against canine parvoviral enteritis. Primodog® (Merial) is a monovalent, attenuated canine parvovirus vaccine administered intramuscularly to three white Leghorn chickens. For a total of five weeks of immunization, 0.5 ml of the initial dose per bird and four further doses, each lowered to 0.25 ml, were given at weekly intervals. As described in the Hodek et al. (2013) protocol, a two-step, labor- and cost-efficient process that involves extracting yolks using tap water then precipitating specific IgY at pH 4 until the final concentration reaches 8.8% with sodium chloride was used to isolate IgY from the hyperimmunized egg yolks. Isolated IgY were freeze-dried and the products' immunogenicity was assessed using sandwich ELISA testing. The data gathered demonstrated the concentration of IgY specific to the canine parvovirus (CPV) following five weeks of immunization and freeze drying. The first week of immunization had the highest measured titer with a mean of 0.796. </w:t>
+        <w:t xml:space="preserve">Humans and animals have historically utilized immunoglobulin Y (IgY), the most common kind of immunoglobulin generated by B cells in avian species, as a therapeutic treatment for passive immunity. This study was conducted to determine the immunogenicity of freeze-dried egg yolk against canine parvoviral enteritis. Primodog® (Merial) is a monovalent, attenuated canine parvovirus vaccine administered intramuscularly to three white Leghorn chickens. For a total of five weeks of immunization, 0.5 ml of the initial dose per bird and four further doses—each lowered to 0.25 ml—were given at weekly intervals. As described in the Hodek et al. (2013) protocol, a two-step, labor- and cost-efficient process that involves extracting yolks using tap water then precipitating specific IgY at pH 4 until the final concentration reaches 8.8% with sodium chloride was used to isolate IgY from the hyperimmunized egg yolks. Isolated IgY were freeze-dried and the products' immunogenicity was assessed using sandwich ELISA testing. The data gathered demonstrated the concentration of IgY specific to the canine parvovirus (CPV) following five weeks of immunization and freeze drying. The first week of immunization had the highest measured titer with a mean of 0.796. </w:t>
       </w:r>
       <w:r>
         <w:rPr>
@@ -26371,7 +26371,7 @@
           <w:strike w:val="0"/>
           <w:color w:val="000000"/>
         </w:rPr>
-        <w:t xml:space="preserve">Companion animals play vital roles in enhancing human well-being but remain vulnerable to a range of toxicants including household products, medications, food items, and ornamental plants. This study assessed the level of awareness among students of Pampanga State Agricultural University (PSAU) regarding common toxicants affecting companion animals. Using a cross-sectional, descriptive design, a structured questionnaire was distributed to a stratified random sample of 393 students. The instrument focused on awareness of specific toxicants, personal experiences, and sources of information. Findings revealed that while chocolate (87.28%) and alcoholic beverages (59.79%) were widely recognized as toxic, awareness of plant-based toxicants such as Philippine lily (18.06%) and avocado (23.41%) was limited. Majority of respondents (42.5%) demonstrated only slight awareness, and 65.14% reported previous unintentional exposure of pets to toxicants, most commonly garlic. Chi-square analysis revealed significant associations between course of study, pet ownership, and source of information with awareness levels. Multiple regression analysis </w:t>
+        <w:t xml:space="preserve">Companion animals play vital roles in enhancing human well-being but remain vulnerable to a range of toxicants including household products, medications, food items, and ornamental plants. This study assessed the level of awareness among students of Pampanga State Agricultural University (PSAU) regarding common toxicants affecting companion animals. Using a cross-sectional, descriptive design, a structured questionnaire was distributed to a stratified random sample of 393 students. The instrument focused on awareness of specific toxicants, personal experiences, and sources of information. Findings revealed that while chocolate (87.28%) and alcoholic beverages (59.79%) were widely recognized as toxic, awareness of plant-based toxicants such as Philippine lily (18.06%) and avocado (23.41%) was limited. Majority of respondents (42.5%) demonstrated only slight awareness, and 65.14% reported previous unintentional exposure of pets to toxicants—most commonly garlic. Chi-square analysis revealed significant associations between course of study, pet ownership, and source of information with awareness levels. Multiple regression analysis </w:t>
       </w:r>
       <w:r>
         <w:rPr>
@@ -26677,7 +26677,7 @@
           <w:strike w:val="0"/>
           <w:color w:val="000000"/>
         </w:rPr>
-        <w:t xml:space="preserve">This study examined the effect of utilizing butterfly pea flower aqueous extract (BPFAE) on the survival rate and locomotor activity of zebrafish larvae, as well as the water quality parameters. A total of 360 five-day post-fertilization zebrafish larvae were randomly distributed into four treatments, 0 parts per thousand (ppt) BPFAE, 5 ppt BPFAE, 10 ppt BPFAE, and 15 ppt BPFAE, with three replicates each, following a completely randomized design. The butterfly pea flower aqueous extract was administered to test subjects for 17 days. The results were analyzed using one-way analysis of variance (One-way ANOVA), P&lt;0.05. Significant comparisons were subjected to Tukey HSD. The results revealed that 10 ppt BPFAE is the optimal inclusion level among all the treatments. This concentration resulted in the highest survival rate (84.44%) as compared to the other treatment groups, 0 ppt (65.55%), 5 ppt (62.22%), and 15 ppt (68.88%). Meanwhile, no significant effects on the locomotor activities of zebrafish larvae were observed in any of the treatments. However, notable reductions in water pH during the first week of administration of treatments, and suboptimal dissolved oxygen concentrations were observed. Additionally, minimal temperature changes within the optimal range were recorded. Lastly, the levels of ammonia, nitrite, and nitrate remained at zero throughout the duration of the experiment. The results demonstrated the </w:t>
+        <w:t xml:space="preserve">This study examined the effect of utilizing butterfly pea flower aqueous extract (BPFAE) on the survival rate and locomotor activity of zebrafish larvae, as well as the water quality parameters. A total of 360 five-day post-fertilization zebrafish larvae were randomly distributed into four treatments— 0 parts per thousand (ppt) BPFAE, 5 ppt BPFAE, 10 ppt BPFAE, and 15 ppt BPFAE, with three replicates each, following a completely randomized design. The butterfly pea flower aqueous extract was administered to test subjects for 17 days. The results were analyzed using one-way analysis of variance (One-way ANOVA), P&lt;0.05. Significant comparisons were subjected to Tukey HSD. The results revealed that 10 ppt BPFAE is the optimal inclusion level among all the treatments. This concentration resulted in the highest survival rate (84.44%) as compared to the other treatment groups — 0 ppt (65.55%), 5 ppt (62.22%), and 15 ppt (68.88%). Meanwhile, no significant effects on the locomotor activities of zebrafish larvae were observed in any of the treatments. However, notable reductions in water pH during the first week of administration of treatments, and suboptimal dissolved oxygen concentrations were observed. Additionally, minimal temperature changes within the optimal range were recorded. Lastly, the levels of ammonia, nitrite, and nitrate remained at zero throughout the duration of the experiment. The results demonstrated the </w:t>
       </w:r>
       <w:r>
         <w:rPr>
@@ -27980,7 +27980,7 @@
           <w:strike w:val="0"/>
           <w:color w:val="000000"/>
         </w:rPr>
-        <w:t xml:space="preserve">This study was conducted to evaluate the growth performance of Adansonii plant under different soil media over a 90-day period. Implemented in December 2024, the experiment followed a Completely Randomized Design (CRD) with five treatments: T1, Topsoil only (control), T2, Topsoil + Rice Hull, T3, Topsoil + Carbonized Rice Hull, T4, Topsoil + Vermicompost, and T5: Topsoil + Biochar. Parameters measured included days to shoot emergence, shoot length, number of leaves, leaf area, root length, number of penetrations, and survival rate. Significant differences were observed across treatments. Treatment 2 (Rice Hull) showed the earliest shoot emergence at 15.29 days, followed by Treatment 4 (Vermicompost) at 15.83 days. These treatments also produced the longest shoots, most leaves, largest leaf areas, and highest survival rates at 87.5%. Treatment 3 (Carbonized Rice Hull) showed moderate growth improvement, while Treatments 1 (Topsoil only) and 5 (Biochar) performed poorly in most parameters, </w:t>
+        <w:t xml:space="preserve">This study was conducted to evaluate the growth performance of Adansonii plant under different soil media over a 90-day period. Implemented in December 2024, the experiment followed a Completely Randomized Design (CRD) with five treatments: T1 — Topsoil only (control), T2 — Topsoil + Rice Hull, T3 — Topsoil + Carbonized Rice Hull, T4 — Topsoil + Vermicompost, and T5 — Topsoil + Biochar. Parameters measured included days to shoot emergence, shoot length, number of leaves, leaf area, root length, number of penetrations, and survival rate. Significant differences were observed across treatments. Treatment 2 (Rice Hull) showed the earliest shoot emergence at 15.29 days, followed by Treatment 4 (Vermicompost) at 15.83 days. These treatments also produced the longest shoots, most leaves, largest leaf areas, and highest survival rates at 87.5%. Treatment 3 (Carbonized Rice Hull) showed moderate growth improvement, while Treatments 1 (Topsoil only) and 5 (Biochar) performed poorly in most parameters, </w:t>
       </w:r>
       <w:r>
         <w:rPr>

</xml_diff>

<commit_message>
Draft_054: enforce Georgia (theme/styles/runs); tense matrix already final-defense
</commit_message>
<xml_diff>
--- a/thesis/003_ThesisProposal_Draft_054.docx
+++ b/thesis/003_ThesisProposal_Draft_054.docx
@@ -24,7 +24,7 @@
       </w:pPr>
       <w:r>
         <w:rPr>
-          <w:rFonts w:ascii="Georgia" w:hAnsi="Georgia"/>
+          <w:rFonts w:ascii="Georgia" w:hAnsi="Georgia" w:cs="Georgia" w:eastAsia="Georgia"/>
           <w:sz w:val="28"/>
           <w:szCs w:val="28"/>
           <w:b/>
@@ -40,7 +40,7 @@
       </w:pPr>
       <w:r>
         <w:rPr>
-          <w:rFonts w:ascii="Georgia" w:hAnsi="Georgia"/>
+          <w:rFonts w:ascii="Georgia" w:hAnsi="Georgia" w:cs="Georgia" w:eastAsia="Georgia"/>
           <w:sz w:val="28"/>
           <w:szCs w:val="28"/>
           <w:b/>
@@ -71,7 +71,7 @@
       </w:pPr>
       <w:r>
         <w:rPr>
-          <w:rFonts w:ascii="Georgia" w:hAnsi="Georgia"/>
+          <w:rFonts w:ascii="Georgia" w:hAnsi="Georgia" w:cs="Georgia" w:eastAsia="Georgia"/>
           <w:sz w:val="24"/>
           <w:szCs w:val="24"/>
         </w:rPr>
@@ -85,7 +85,7 @@
       </w:pPr>
       <w:r>
         <w:rPr>
-          <w:rFonts w:ascii="Georgia" w:hAnsi="Georgia"/>
+          <w:rFonts w:ascii="Georgia" w:hAnsi="Georgia" w:cs="Georgia" w:eastAsia="Georgia"/>
           <w:sz w:val="24"/>
           <w:szCs w:val="24"/>
         </w:rPr>
@@ -99,7 +99,7 @@
       </w:pPr>
       <w:r>
         <w:rPr>
-          <w:rFonts w:ascii="Georgia" w:hAnsi="Georgia"/>
+          <w:rFonts w:ascii="Georgia" w:hAnsi="Georgia" w:cs="Georgia" w:eastAsia="Georgia"/>
           <w:sz w:val="24"/>
           <w:szCs w:val="24"/>
         </w:rPr>
@@ -113,7 +113,7 @@
       </w:pPr>
       <w:r>
         <w:rPr>
-          <w:rFonts w:ascii="Georgia" w:hAnsi="Georgia"/>
+          <w:rFonts w:ascii="Georgia" w:hAnsi="Georgia" w:cs="Georgia" w:eastAsia="Georgia"/>
           <w:sz w:val="24"/>
           <w:szCs w:val="24"/>
         </w:rPr>
@@ -127,7 +127,7 @@
       </w:pPr>
       <w:r>
         <w:rPr>
-          <w:rFonts w:ascii="Georgia" w:hAnsi="Georgia"/>
+          <w:rFonts w:ascii="Georgia" w:hAnsi="Georgia" w:cs="Georgia" w:eastAsia="Georgia"/>
           <w:sz w:val="24"/>
           <w:szCs w:val="24"/>
         </w:rPr>
@@ -141,7 +141,7 @@
       </w:pPr>
       <w:r>
         <w:rPr>
-          <w:rFonts w:ascii="Georgia" w:hAnsi="Georgia"/>
+          <w:rFonts w:ascii="Georgia" w:hAnsi="Georgia" w:cs="Georgia" w:eastAsia="Georgia"/>
           <w:sz w:val="24"/>
           <w:szCs w:val="24"/>
         </w:rPr>
@@ -170,7 +170,7 @@
       </w:pPr>
       <w:r>
         <w:rPr>
-          <w:rFonts w:ascii="Georgia" w:hAnsi="Georgia"/>
+          <w:rFonts w:ascii="Georgia" w:hAnsi="Georgia" w:cs="Georgia" w:eastAsia="Georgia"/>
           <w:sz w:val="24"/>
           <w:szCs w:val="24"/>
         </w:rPr>
@@ -184,7 +184,7 @@
       </w:pPr>
       <w:r>
         <w:rPr>
-          <w:rFonts w:ascii="Georgia" w:hAnsi="Georgia"/>
+          <w:rFonts w:ascii="Georgia" w:hAnsi="Georgia" w:cs="Georgia" w:eastAsia="Georgia"/>
           <w:sz w:val="24"/>
           <w:szCs w:val="24"/>
         </w:rPr>
@@ -198,7 +198,7 @@
       </w:pPr>
       <w:r>
         <w:rPr>
-          <w:rFonts w:ascii="Georgia" w:hAnsi="Georgia"/>
+          <w:rFonts w:ascii="Georgia" w:hAnsi="Georgia" w:cs="Georgia" w:eastAsia="Georgia"/>
           <w:sz w:val="24"/>
           <w:szCs w:val="24"/>
         </w:rPr>
@@ -227,7 +227,7 @@
       </w:pPr>
       <w:r>
         <w:rPr>
-          <w:rFonts w:ascii="Georgia" w:hAnsi="Georgia"/>
+          <w:rFonts w:ascii="Georgia" w:hAnsi="Georgia" w:cs="Georgia" w:eastAsia="Georgia"/>
           <w:sz w:val="24"/>
           <w:szCs w:val="24"/>
         </w:rPr>
@@ -266,7 +266,7 @@
       </w:pPr>
       <w:r>
         <w:rPr>
-          <w:rFonts w:ascii="Georgia" w:hAnsi="Georgia"/>
+          <w:rFonts w:ascii="Georgia" w:hAnsi="Georgia" w:cs="Georgia" w:eastAsia="Georgia"/>
           <w:sz w:val="24"/>
           <w:szCs w:val="24"/>
           <w:b/>
@@ -294,7 +294,7 @@
       </w:pPr>
       <w:r>
         <w:rPr>
-          <w:rFonts w:ascii="Georgia" w:hAnsi="Georgia"/>
+          <w:rFonts w:ascii="Georgia" w:hAnsi="Georgia" w:cs="Georgia" w:eastAsia="Georgia"/>
           <w:sz w:val="24"/>
           <w:szCs w:val="24"/>
         </w:rPr>
@@ -1142,7 +1142,7 @@
       </w:pPr>
       <w:r>
         <w:rPr>
-          <w:rFonts w:ascii="Georgia" w:hAnsi="Georgia"/>
+          <w:rFonts w:ascii="Georgia" w:hAnsi="Georgia" w:cs="Georgia" w:eastAsia="Georgia"/>
           <w:sz w:val="22"/>
           <w:szCs w:val="22"/>
         </w:rPr>
@@ -2158,7 +2158,7 @@
       </w:pPr>
       <w:r>
         <w:rPr>
-          <w:rFonts w:ascii="Georgia" w:hAnsi="Georgia"/>
+          <w:rFonts w:ascii="Georgia" w:hAnsi="Georgia" w:cs="Georgia" w:eastAsia="Georgia"/>
           <w:sz w:val="22"/>
           <w:szCs w:val="22"/>
           <w:b/>
@@ -2168,7 +2168,7 @@
       </w:r>
       <w:r>
         <w:rPr>
-          <w:rFonts w:ascii="Georgia" w:hAnsi="Georgia"/>
+          <w:rFonts w:ascii="Georgia" w:hAnsi="Georgia" w:cs="Georgia" w:eastAsia="Georgia"/>
           <w:sz w:val="22"/>
           <w:szCs w:val="22"/>
         </w:rPr>
@@ -2223,7 +2223,7 @@
       </w:pPr>
       <w:r>
         <w:rPr>
-          <w:rFonts w:ascii="Georgia" w:hAnsi="Georgia"/>
+          <w:rFonts w:ascii="Georgia" w:hAnsi="Georgia" w:cs="Georgia" w:eastAsia="Georgia"/>
           <w:sz w:val="22"/>
           <w:szCs w:val="22"/>
           <w:b/>
@@ -2233,7 +2233,7 @@
       </w:r>
       <w:r>
         <w:rPr>
-          <w:rFonts w:ascii="Georgia" w:hAnsi="Georgia"/>
+          <w:rFonts w:ascii="Georgia" w:hAnsi="Georgia" w:cs="Georgia" w:eastAsia="Georgia"/>
           <w:sz w:val="22"/>
           <w:szCs w:val="22"/>
         </w:rPr>
@@ -2867,7 +2867,7 @@
       </w:pPr>
       <w:r>
         <w:rPr>
-          <w:rFonts w:ascii="Georgia" w:hAnsi="Georgia"/>
+          <w:rFonts w:ascii="Georgia" w:hAnsi="Georgia" w:cs="Georgia" w:eastAsia="Georgia"/>
           <w:sz w:val="22"/>
           <w:szCs w:val="22"/>
           <w:b/>
@@ -2877,7 +2877,7 @@
       </w:r>
       <w:r>
         <w:rPr>
-          <w:rFonts w:ascii="Georgia" w:hAnsi="Georgia"/>
+          <w:rFonts w:ascii="Georgia" w:hAnsi="Georgia" w:cs="Georgia" w:eastAsia="Georgia"/>
           <w:sz w:val="22"/>
           <w:szCs w:val="22"/>
         </w:rPr>
@@ -3035,7 +3035,7 @@
       </w:pPr>
       <w:r>
         <w:rPr>
-          <w:rFonts w:ascii="Georgia" w:hAnsi="Georgia"/>
+          <w:rFonts w:ascii="Georgia" w:hAnsi="Georgia" w:cs="Georgia" w:eastAsia="Georgia"/>
           <w:b/>
           <w:sz w:val="24"/>
         </w:rPr>
@@ -3050,7 +3050,7 @@
       </w:pPr>
       <w:r>
         <w:rPr>
-          <w:rFonts w:ascii="Georgia" w:hAnsi="Georgia"/>
+          <w:rFonts w:ascii="Georgia" w:hAnsi="Georgia" w:cs="Georgia" w:eastAsia="Georgia"/>
           <w:sz w:val="24"/>
         </w:rPr>
         <w:t>PSAU Thesis Repository: Population and Sampling Summary</w:t>
@@ -4267,7 +4267,7 @@
       </w:pPr>
       <w:r>
         <w:rPr>
-          <w:rFonts w:ascii="Georgia" w:hAnsi="Georgia"/>
+          <w:rFonts w:ascii="Georgia" w:hAnsi="Georgia" w:cs="Georgia" w:eastAsia="Georgia"/>
           <w:sz w:val="22"/>
           <w:szCs w:val="22"/>
           <w:b/>
@@ -4277,7 +4277,7 @@
       </w:r>
       <w:r>
         <w:rPr>
-          <w:rFonts w:ascii="Georgia" w:hAnsi="Georgia"/>
+          <w:rFonts w:ascii="Georgia" w:hAnsi="Georgia" w:cs="Georgia" w:eastAsia="Georgia"/>
           <w:sz w:val="22"/>
           <w:szCs w:val="22"/>
         </w:rPr>
@@ -4293,7 +4293,7 @@
       </w:pPr>
       <w:r>
         <w:rPr>
-          <w:rFonts w:ascii="Georgia" w:hAnsi="Georgia"/>
+          <w:rFonts w:ascii="Georgia" w:hAnsi="Georgia" w:cs="Georgia" w:eastAsia="Georgia"/>
           <w:sz w:val="22"/>
           <w:szCs w:val="22"/>
           <w:b/>
@@ -4303,7 +4303,7 @@
       </w:r>
       <w:r>
         <w:rPr>
-          <w:rFonts w:ascii="Georgia" w:hAnsi="Georgia"/>
+          <w:rFonts w:ascii="Georgia" w:hAnsi="Georgia" w:cs="Georgia" w:eastAsia="Georgia"/>
           <w:sz w:val="22"/>
           <w:szCs w:val="22"/>
         </w:rPr>
@@ -4327,7 +4327,7 @@
       </w:pPr>
       <w:r>
         <w:rPr>
-          <w:rFonts w:ascii="Georgia" w:hAnsi="Georgia"/>
+          <w:rFonts w:ascii="Georgia" w:hAnsi="Georgia" w:cs="Georgia" w:eastAsia="Georgia"/>
           <w:sz w:val="22"/>
           <w:szCs w:val="22"/>
           <w:b/>
@@ -4337,7 +4337,7 @@
       </w:r>
       <w:r>
         <w:rPr>
-          <w:rFonts w:ascii="Georgia" w:hAnsi="Georgia"/>
+          <w:rFonts w:ascii="Georgia" w:hAnsi="Georgia" w:cs="Georgia" w:eastAsia="Georgia"/>
           <w:sz w:val="22"/>
           <w:szCs w:val="22"/>
         </w:rPr>
@@ -4455,7 +4455,7 @@
       </w:pPr>
       <w:r>
         <w:rPr>
-          <w:rFonts w:ascii="Georgia" w:hAnsi="Georgia"/>
+          <w:rFonts w:ascii="Georgia" w:hAnsi="Georgia" w:cs="Georgia" w:eastAsia="Georgia"/>
           <w:b/>
           <w:sz w:val="24"/>
         </w:rPr>
@@ -4470,7 +4470,7 @@
       </w:pPr>
       <w:r>
         <w:rPr>
-          <w:rFonts w:ascii="Georgia" w:hAnsi="Georgia"/>
+          <w:rFonts w:ascii="Georgia" w:hAnsi="Georgia" w:cs="Georgia" w:eastAsia="Georgia"/>
           <w:sz w:val="24"/>
         </w:rPr>
         <w:t>Hedge Type Distribution Across the Corpus</w:t>
@@ -7019,7 +7019,7 @@
       </w:pPr>
       <w:r>
         <w:rPr>
-          <w:rFonts w:ascii="Georgia" w:hAnsi="Georgia"/>
+          <w:rFonts w:ascii="Georgia" w:hAnsi="Georgia" w:cs="Georgia" w:eastAsia="Georgia"/>
           <w:b/>
           <w:sz w:val="24"/>
         </w:rPr>
@@ -7034,7 +7034,7 @@
       </w:pPr>
       <w:r>
         <w:rPr>
-          <w:rFonts w:ascii="Georgia" w:hAnsi="Georgia"/>
+          <w:rFonts w:ascii="Georgia" w:hAnsi="Georgia" w:cs="Georgia" w:eastAsia="Georgia"/>
           <w:sz w:val="24"/>
         </w:rPr>
         <w:t>Hedge Type Distribution by Discipline</w:t>
@@ -8247,7 +8247,7 @@
       </w:pPr>
       <w:r>
         <w:rPr>
-          <w:rFonts w:ascii="Georgia" w:hAnsi="Georgia"/>
+          <w:rFonts w:ascii="Georgia" w:hAnsi="Georgia" w:cs="Georgia" w:eastAsia="Georgia"/>
           <w:b/>
           <w:sz w:val="24"/>
         </w:rPr>
@@ -8262,7 +8262,7 @@
       </w:pPr>
       <w:r>
         <w:rPr>
-          <w:rFonts w:ascii="Georgia" w:hAnsi="Georgia"/>
+          <w:rFonts w:ascii="Georgia" w:hAnsi="Georgia" w:cs="Georgia" w:eastAsia="Georgia"/>
           <w:sz w:val="24"/>
         </w:rPr>
         <w:t>Hedge Frequency by Discipline</w:t>
@@ -9870,7 +9870,7 @@
       </w:pPr>
       <w:r>
         <w:rPr>
-          <w:rFonts w:ascii="Georgia" w:hAnsi="Georgia"/>
+          <w:rFonts w:ascii="Georgia" w:hAnsi="Georgia" w:cs="Georgia" w:eastAsia="Georgia"/>
           <w:b/>
           <w:sz w:val="24"/>
         </w:rPr>
@@ -9885,7 +9885,7 @@
       </w:pPr>
       <w:r>
         <w:rPr>
-          <w:rFonts w:ascii="Georgia" w:hAnsi="Georgia"/>
+          <w:rFonts w:ascii="Georgia" w:hAnsi="Georgia" w:cs="Georgia" w:eastAsia="Georgia"/>
           <w:sz w:val="24"/>
         </w:rPr>
         <w:t>Hedge Function Distribution (Among Coded Hedges)</w:t>
@@ -11717,7 +11717,7 @@
       </w:pPr>
       <w:r>
         <w:rPr>
-          <w:rFonts w:ascii="Georgia" w:hAnsi="Georgia"/>
+          <w:rFonts w:ascii="Georgia" w:hAnsi="Georgia" w:cs="Georgia" w:eastAsia="Georgia"/>
           <w:sz w:val="22"/>
           <w:szCs w:val="22"/>
         </w:rPr>
@@ -31062,9 +31062,9 @@
     </a:clrScheme>
     <a:fontScheme name="Office">
       <a:majorFont>
-        <a:latin typeface="Calibri"/>
-        <a:ea typeface=""/>
-        <a:cs typeface=""/>
+        <a:latin typeface="Georgia"/>
+        <a:ea typeface="Georgia"/>
+        <a:cs typeface="Georgia"/>
         <a:font script="Jpan" typeface="ＭＳ ゴシック"/>
         <a:font script="Hang" typeface="맑은 고딕"/>
         <a:font script="Hans" typeface="宋体"/>
@@ -31097,9 +31097,9 @@
         <a:font script="Geor" typeface="Sylfaen"/>
       </a:majorFont>
       <a:minorFont>
-        <a:latin typeface="Cambria"/>
-        <a:ea typeface=""/>
-        <a:cs typeface=""/>
+        <a:latin typeface="Georgia"/>
+        <a:ea typeface="Georgia"/>
+        <a:cs typeface="Georgia"/>
         <a:font script="Jpan" typeface="ＭＳ 明朝"/>
         <a:font script="Hang" typeface="맑은 고딕"/>
         <a:font script="Hans" typeface="宋体"/>

</xml_diff>